<commit_message>
Fix: Dashboard header responsiveness
</commit_message>
<xml_diff>
--- a/frontend/public/templates/ReportTemplate.docx
+++ b/frontend/public/templates/ReportTemplate.docx
@@ -545,7 +545,7 @@
                 <w:sz w:val="18"/>
                 <w:szCs w:val="18"/>
               </w:rPr>
-              <w:t>1</w:t>
+              <w:t>2</w:t>
             </w:r>
             <w:r>
               <w:rPr>
@@ -803,7 +803,7 @@
                 <w:sz w:val="18"/>
                 <w:szCs w:val="18"/>
               </w:rPr>
-              <w:t>2</w:t>
+              <w:t>1</w:t>
             </w:r>
             <w:r>
               <w:rPr>
@@ -1106,7 +1106,21 @@
                 <w:sz w:val="18"/>
                 <w:szCs w:val="18"/>
               </w:rPr>
-              <w:t>{gender_name1}</w:t>
+              <w:t>{gender_name</w:t>
+            </w:r>
+            <w:r>
+              <w:rPr>
+                <w:sz w:val="18"/>
+                <w:szCs w:val="18"/>
+              </w:rPr>
+              <w:t>2</w:t>
+            </w:r>
+            <w:r>
+              <w:rPr>
+                <w:sz w:val="18"/>
+                <w:szCs w:val="18"/>
+              </w:rPr>
+              <w:t>}</w:t>
             </w:r>
           </w:p>
         </w:tc>
@@ -1174,21 +1188,7 @@
                 <w:sz w:val="18"/>
                 <w:szCs w:val="18"/>
               </w:rPr>
-              <w:t>{gender_summary_positive</w:t>
-            </w:r>
-            <w:r>
-              <w:rPr>
-                <w:sz w:val="18"/>
-                <w:szCs w:val="18"/>
-              </w:rPr>
-              <w:t>1</w:t>
-            </w:r>
-            <w:r>
-              <w:rPr>
-                <w:sz w:val="18"/>
-                <w:szCs w:val="18"/>
-              </w:rPr>
-              <w:t>}</w:t>
+              <w:t>{gender_summary_positive1}</w:t>
             </w:r>
           </w:p>
         </w:tc>
@@ -1204,7 +1204,21 @@
                 <w:sz w:val="18"/>
                 <w:szCs w:val="18"/>
               </w:rPr>
-              <w:t>{gender_name2}</w:t>
+              <w:t>{gender_name</w:t>
+            </w:r>
+            <w:r>
+              <w:rPr>
+                <w:sz w:val="18"/>
+                <w:szCs w:val="18"/>
+              </w:rPr>
+              <w:t>1</w:t>
+            </w:r>
+            <w:r>
+              <w:rPr>
+                <w:sz w:val="18"/>
+                <w:szCs w:val="18"/>
+              </w:rPr>
+              <w:t>}</w:t>
             </w:r>
           </w:p>
         </w:tc>
@@ -1224,21 +1238,7 @@
                 <w:sz w:val="18"/>
                 <w:szCs w:val="18"/>
               </w:rPr>
-              <w:t>{gender_summary_negative</w:t>
-            </w:r>
-            <w:r>
-              <w:rPr>
-                <w:sz w:val="18"/>
-                <w:szCs w:val="18"/>
-              </w:rPr>
-              <w:t>2</w:t>
-            </w:r>
-            <w:r>
-              <w:rPr>
-                <w:sz w:val="18"/>
-                <w:szCs w:val="18"/>
-              </w:rPr>
-              <w:t>}</w:t>
+              <w:t>{gender_summary_negative2}</w:t>
             </w:r>
           </w:p>
           <w:p>
@@ -1266,21 +1266,7 @@
                 <w:sz w:val="18"/>
                 <w:szCs w:val="18"/>
               </w:rPr>
-              <w:t>{gender_summary_neutral</w:t>
-            </w:r>
-            <w:r>
-              <w:rPr>
-                <w:sz w:val="18"/>
-                <w:szCs w:val="18"/>
-              </w:rPr>
-              <w:t>2</w:t>
-            </w:r>
-            <w:r>
-              <w:rPr>
-                <w:sz w:val="18"/>
-                <w:szCs w:val="18"/>
-              </w:rPr>
-              <w:t>}</w:t>
+              <w:t>{gender_summary_neutral2}</w:t>
             </w:r>
           </w:p>
         </w:tc>
@@ -2691,21 +2677,7 @@
                 <w:sz w:val="18"/>
                 <w:szCs w:val="18"/>
               </w:rPr>
-              <w:t>{service_summary_positive</w:t>
-            </w:r>
-            <w:r>
-              <w:rPr>
-                <w:sz w:val="18"/>
-                <w:szCs w:val="18"/>
-              </w:rPr>
-              <w:t>4</w:t>
-            </w:r>
-            <w:r>
-              <w:rPr>
-                <w:sz w:val="18"/>
-                <w:szCs w:val="18"/>
-              </w:rPr>
-              <w:t>}</w:t>
+              <w:t>{service_summary_positive4}</w:t>
             </w:r>
           </w:p>
           <w:p>
@@ -2735,21 +2707,7 @@
                 <w:sz w:val="18"/>
                 <w:szCs w:val="18"/>
               </w:rPr>
-              <w:t>{service_summary_positive</w:t>
-            </w:r>
-            <w:r>
-              <w:rPr>
-                <w:sz w:val="18"/>
-                <w:szCs w:val="18"/>
-              </w:rPr>
-              <w:t>4</w:t>
-            </w:r>
-            <w:r>
-              <w:rPr>
-                <w:sz w:val="18"/>
-                <w:szCs w:val="18"/>
-              </w:rPr>
-              <w:t>}</w:t>
+              <w:t>{service_summary_positive4}</w:t>
             </w:r>
           </w:p>
           <w:p>
@@ -2779,21 +2737,7 @@
                 <w:sz w:val="18"/>
                 <w:szCs w:val="18"/>
               </w:rPr>
-              <w:t>{service_summary_positive</w:t>
-            </w:r>
-            <w:r>
-              <w:rPr>
-                <w:sz w:val="18"/>
-                <w:szCs w:val="18"/>
-              </w:rPr>
-              <w:t>4</w:t>
-            </w:r>
-            <w:r>
-              <w:rPr>
-                <w:sz w:val="18"/>
-                <w:szCs w:val="18"/>
-              </w:rPr>
-              <w:t>}</w:t>
+              <w:t>{service_summary_positive4}</w:t>
             </w:r>
           </w:p>
           <w:p>
@@ -2888,21 +2832,7 @@
                 <w:sz w:val="18"/>
                 <w:szCs w:val="18"/>
               </w:rPr>
-              <w:t>{theme_percentage</w:t>
-            </w:r>
-            <w:r>
-              <w:rPr>
-                <w:sz w:val="18"/>
-                <w:szCs w:val="18"/>
-              </w:rPr>
-              <w:t>1</w:t>
-            </w:r>
-            <w:r>
-              <w:rPr>
-                <w:sz w:val="18"/>
-                <w:szCs w:val="18"/>
-              </w:rPr>
-              <w:t>}%</w:t>
+              <w:t>{theme_percentage1}%</w:t>
             </w:r>
           </w:p>
         </w:tc>
@@ -2953,21 +2883,7 @@
                 <w:sz w:val="18"/>
                 <w:szCs w:val="18"/>
               </w:rPr>
-              <w:t>{theme_percentage</w:t>
-            </w:r>
-            <w:r>
-              <w:rPr>
-                <w:sz w:val="18"/>
-                <w:szCs w:val="18"/>
-              </w:rPr>
-              <w:t>2</w:t>
-            </w:r>
-            <w:r>
-              <w:rPr>
-                <w:sz w:val="18"/>
-                <w:szCs w:val="18"/>
-              </w:rPr>
-              <w:t>}%</w:t>
+              <w:t>{theme_percentage2}%</w:t>
             </w:r>
           </w:p>
         </w:tc>

</xml_diff>

<commit_message>
Fix: dynamic rendering of service and gender chart in exported docx file
</commit_message>
<xml_diff>
--- a/frontend/public/templates/ReportTemplate.docx
+++ b/frontend/public/templates/ReportTemplate.docx
@@ -371,32 +371,32 @@
         <w:tblLook w:val="04A0" w:firstRow="1" w:lastRow="0" w:firstColumn="1" w:lastColumn="0" w:noHBand="0" w:noVBand="1"/>
       </w:tblPr>
       <w:tblGrid>
-        <w:gridCol w:w="1482"/>
-        <w:gridCol w:w="1517"/>
-        <w:gridCol w:w="1475"/>
-        <w:gridCol w:w="1452"/>
-        <w:gridCol w:w="1206"/>
-        <w:gridCol w:w="1212"/>
-        <w:gridCol w:w="1006"/>
+        <w:gridCol w:w="2407"/>
+        <w:gridCol w:w="964"/>
+        <w:gridCol w:w="878"/>
+        <w:gridCol w:w="977"/>
+        <w:gridCol w:w="852"/>
+        <w:gridCol w:w="942"/>
+        <w:gridCol w:w="2330"/>
       </w:tblGrid>
       <w:tr>
         <w:tc>
           <w:tcPr>
-            <w:tcW w:w="1449" w:type="dxa"/>
-          </w:tcPr>
-          <w:p>
-            <w:pPr>
-              <w:jc w:val="center"/>
-              <w:rPr>
-                <w:sz w:val="18"/>
-                <w:szCs w:val="18"/>
-              </w:rPr>
-            </w:pPr>
-          </w:p>
-        </w:tc>
-        <w:tc>
-          <w:tcPr>
-            <w:tcW w:w="1525" w:type="dxa"/>
+            <w:tcW w:w="1482" w:type="dxa"/>
+          </w:tcPr>
+          <w:p>
+            <w:pPr>
+              <w:jc w:val="center"/>
+              <w:rPr>
+                <w:sz w:val="18"/>
+                <w:szCs w:val="18"/>
+              </w:rPr>
+            </w:pPr>
+          </w:p>
+        </w:tc>
+        <w:tc>
+          <w:tcPr>
+            <w:tcW w:w="1517" w:type="dxa"/>
           </w:tcPr>
           <w:p>
             <w:pPr>
@@ -417,7 +417,7 @@
         </w:tc>
         <w:tc>
           <w:tcPr>
-            <w:tcW w:w="1483" w:type="dxa"/>
+            <w:tcW w:w="1475" w:type="dxa"/>
           </w:tcPr>
           <w:p>
             <w:pPr>
@@ -438,7 +438,7 @@
         </w:tc>
         <w:tc>
           <w:tcPr>
-            <w:tcW w:w="1458" w:type="dxa"/>
+            <w:tcW w:w="1452" w:type="dxa"/>
           </w:tcPr>
           <w:p>
             <w:pPr>
@@ -459,7 +459,7 @@
         </w:tc>
         <w:tc>
           <w:tcPr>
-            <w:tcW w:w="1211" w:type="dxa"/>
+            <w:tcW w:w="1206" w:type="dxa"/>
           </w:tcPr>
           <w:p>
             <w:pPr>
@@ -480,7 +480,7 @@
         </w:tc>
         <w:tc>
           <w:tcPr>
-            <w:tcW w:w="1216" w:type="dxa"/>
+            <w:tcW w:w="1212" w:type="dxa"/>
           </w:tcPr>
           <w:p>
             <w:pPr>
@@ -501,7 +501,7 @@
         </w:tc>
         <w:tc>
           <w:tcPr>
-            <w:tcW w:w="1008" w:type="dxa"/>
+            <w:tcW w:w="1006" w:type="dxa"/>
           </w:tcPr>
           <w:p>
             <w:pPr>
@@ -524,7 +524,7 @@
       <w:tr>
         <w:tc>
           <w:tcPr>
-            <w:tcW w:w="1449" w:type="dxa"/>
+            <w:tcW w:w="1482" w:type="dxa"/>
           </w:tcPr>
           <w:p>
             <w:pPr>
@@ -558,7 +558,7 @@
         </w:tc>
         <w:tc>
           <w:tcPr>
-            <w:tcW w:w="1525" w:type="dxa"/>
+            <w:tcW w:w="1517" w:type="dxa"/>
           </w:tcPr>
           <w:p>
             <w:pPr>
@@ -595,7 +595,7 @@
         </w:tc>
         <w:tc>
           <w:tcPr>
-            <w:tcW w:w="1483" w:type="dxa"/>
+            <w:tcW w:w="1475" w:type="dxa"/>
           </w:tcPr>
           <w:p>
             <w:pPr>
@@ -632,7 +632,7 @@
         </w:tc>
         <w:tc>
           <w:tcPr>
-            <w:tcW w:w="1458" w:type="dxa"/>
+            <w:tcW w:w="1452" w:type="dxa"/>
           </w:tcPr>
           <w:p>
             <w:pPr>
@@ -669,7 +669,7 @@
         </w:tc>
         <w:tc>
           <w:tcPr>
-            <w:tcW w:w="1211" w:type="dxa"/>
+            <w:tcW w:w="1206" w:type="dxa"/>
           </w:tcPr>
           <w:p>
             <w:pPr>
@@ -706,7 +706,7 @@
         </w:tc>
         <w:tc>
           <w:tcPr>
-            <w:tcW w:w="1216" w:type="dxa"/>
+            <w:tcW w:w="1212" w:type="dxa"/>
           </w:tcPr>
           <w:p>
             <w:pPr>
@@ -743,7 +743,7 @@
         </w:tc>
         <w:tc>
           <w:tcPr>
-            <w:tcW w:w="1008" w:type="dxa"/>
+            <w:tcW w:w="1006" w:type="dxa"/>
           </w:tcPr>
           <w:p>
             <w:pPr>
@@ -782,7 +782,7 @@
       <w:tr>
         <w:tc>
           <w:tcPr>
-            <w:tcW w:w="1449" w:type="dxa"/>
+            <w:tcW w:w="1482" w:type="dxa"/>
           </w:tcPr>
           <w:p>
             <w:pPr>
@@ -816,7 +816,7 @@
         </w:tc>
         <w:tc>
           <w:tcPr>
-            <w:tcW w:w="1525" w:type="dxa"/>
+            <w:tcW w:w="1517" w:type="dxa"/>
           </w:tcPr>
           <w:p>
             <w:pPr>
@@ -837,7 +837,7 @@
         </w:tc>
         <w:tc>
           <w:tcPr>
-            <w:tcW w:w="1483" w:type="dxa"/>
+            <w:tcW w:w="1475" w:type="dxa"/>
           </w:tcPr>
           <w:p>
             <w:pPr>
@@ -872,7 +872,7 @@
         </w:tc>
         <w:tc>
           <w:tcPr>
-            <w:tcW w:w="1458" w:type="dxa"/>
+            <w:tcW w:w="1452" w:type="dxa"/>
           </w:tcPr>
           <w:p>
             <w:pPr>
@@ -893,7 +893,7 @@
         </w:tc>
         <w:tc>
           <w:tcPr>
-            <w:tcW w:w="1211" w:type="dxa"/>
+            <w:tcW w:w="1206" w:type="dxa"/>
           </w:tcPr>
           <w:p>
             <w:pPr>
@@ -914,7 +914,7 @@
         </w:tc>
         <w:tc>
           <w:tcPr>
-            <w:tcW w:w="1216" w:type="dxa"/>
+            <w:tcW w:w="1212" w:type="dxa"/>
           </w:tcPr>
           <w:p>
             <w:pPr>
@@ -942,7 +942,7 @@
         </w:tc>
         <w:tc>
           <w:tcPr>
-            <w:tcW w:w="1008" w:type="dxa"/>
+            <w:tcW w:w="1006" w:type="dxa"/>
           </w:tcPr>
           <w:p>
             <w:pPr>
@@ -958,6 +958,287 @@
                 <w:szCs w:val="18"/>
               </w:rPr>
               <w:t>{posC2}</w:t>
+            </w:r>
+          </w:p>
+        </w:tc>
+      </w:tr>
+      <w:tr>
+        <w:tc>
+          <w:tcPr>
+            <w:tcW w:w="1482" w:type="dxa"/>
+          </w:tcPr>
+          <w:p>
+            <w:pPr>
+              <w:rPr>
+                <w:sz w:val="18"/>
+                <w:szCs w:val="18"/>
+              </w:rPr>
+            </w:pPr>
+            <w:r>
+              <w:rPr>
+                <w:color w:val="000000"/>
+                <w:sz w:val="18"/>
+                <w:szCs w:val="18"/>
+              </w:rPr>
+              <w:t>{#additional_genders}{name}</w:t>
+            </w:r>
+          </w:p>
+        </w:tc>
+        <w:tc>
+          <w:tcPr>
+            <w:tcW w:w="1517" w:type="dxa"/>
+          </w:tcPr>
+          <w:p>
+            <w:pPr>
+              <w:jc w:val="center"/>
+              <w:rPr>
+                <w:sz w:val="18"/>
+                <w:szCs w:val="18"/>
+              </w:rPr>
+            </w:pPr>
+            <w:r>
+              <w:rPr>
+                <w:color w:val="000000"/>
+                <w:sz w:val="18"/>
+                <w:szCs w:val="18"/>
+              </w:rPr>
+              <w:t>{</w:t>
+            </w:r>
+            <w:proofErr w:type="spellStart"/>
+            <w:r>
+              <w:rPr>
+                <w:color w:val="000000"/>
+                <w:sz w:val="18"/>
+                <w:szCs w:val="18"/>
+              </w:rPr>
+              <w:t>negP</w:t>
+            </w:r>
+            <w:proofErr w:type="spellEnd"/>
+            <w:r>
+              <w:rPr>
+                <w:color w:val="000000"/>
+                <w:sz w:val="18"/>
+                <w:szCs w:val="18"/>
+              </w:rPr>
+              <w:t>}%</w:t>
+            </w:r>
+          </w:p>
+        </w:tc>
+        <w:tc>
+          <w:tcPr>
+            <w:tcW w:w="1475" w:type="dxa"/>
+          </w:tcPr>
+          <w:p>
+            <w:pPr>
+              <w:jc w:val="center"/>
+              <w:rPr>
+                <w:sz w:val="18"/>
+                <w:szCs w:val="18"/>
+              </w:rPr>
+            </w:pPr>
+            <w:r>
+              <w:rPr>
+                <w:color w:val="000000"/>
+                <w:sz w:val="18"/>
+                <w:szCs w:val="18"/>
+              </w:rPr>
+              <w:t>{</w:t>
+            </w:r>
+            <w:proofErr w:type="spellStart"/>
+            <w:r>
+              <w:rPr>
+                <w:color w:val="000000"/>
+                <w:sz w:val="18"/>
+                <w:szCs w:val="18"/>
+              </w:rPr>
+              <w:t>negC</w:t>
+            </w:r>
+            <w:proofErr w:type="spellEnd"/>
+            <w:r>
+              <w:rPr>
+                <w:color w:val="000000"/>
+                <w:sz w:val="18"/>
+                <w:szCs w:val="18"/>
+              </w:rPr>
+              <w:t>}</w:t>
+            </w:r>
+          </w:p>
+        </w:tc>
+        <w:tc>
+          <w:tcPr>
+            <w:tcW w:w="1452" w:type="dxa"/>
+          </w:tcPr>
+          <w:p>
+            <w:pPr>
+              <w:jc w:val="center"/>
+              <w:rPr>
+                <w:sz w:val="18"/>
+                <w:szCs w:val="18"/>
+              </w:rPr>
+            </w:pPr>
+            <w:r>
+              <w:rPr>
+                <w:color w:val="000000"/>
+                <w:sz w:val="18"/>
+                <w:szCs w:val="18"/>
+              </w:rPr>
+              <w:t>{</w:t>
+            </w:r>
+            <w:proofErr w:type="spellStart"/>
+            <w:r>
+              <w:rPr>
+                <w:color w:val="000000"/>
+                <w:sz w:val="18"/>
+                <w:szCs w:val="18"/>
+              </w:rPr>
+              <w:t>neuP</w:t>
+            </w:r>
+            <w:proofErr w:type="spellEnd"/>
+            <w:r>
+              <w:rPr>
+                <w:color w:val="000000"/>
+                <w:sz w:val="18"/>
+                <w:szCs w:val="18"/>
+              </w:rPr>
+              <w:t>}%</w:t>
+            </w:r>
+          </w:p>
+        </w:tc>
+        <w:tc>
+          <w:tcPr>
+            <w:tcW w:w="1206" w:type="dxa"/>
+          </w:tcPr>
+          <w:p>
+            <w:pPr>
+              <w:jc w:val="center"/>
+              <w:rPr>
+                <w:sz w:val="18"/>
+                <w:szCs w:val="18"/>
+              </w:rPr>
+            </w:pPr>
+            <w:r>
+              <w:rPr>
+                <w:color w:val="000000"/>
+                <w:sz w:val="18"/>
+                <w:szCs w:val="18"/>
+              </w:rPr>
+              <w:t>{</w:t>
+            </w:r>
+            <w:proofErr w:type="spellStart"/>
+            <w:r>
+              <w:rPr>
+                <w:color w:val="000000"/>
+                <w:sz w:val="18"/>
+                <w:szCs w:val="18"/>
+              </w:rPr>
+              <w:t>neuC</w:t>
+            </w:r>
+            <w:proofErr w:type="spellEnd"/>
+            <w:r>
+              <w:rPr>
+                <w:color w:val="000000"/>
+                <w:sz w:val="18"/>
+                <w:szCs w:val="18"/>
+              </w:rPr>
+              <w:t>}</w:t>
+            </w:r>
+          </w:p>
+        </w:tc>
+        <w:tc>
+          <w:tcPr>
+            <w:tcW w:w="1212" w:type="dxa"/>
+          </w:tcPr>
+          <w:p>
+            <w:pPr>
+              <w:jc w:val="center"/>
+              <w:rPr>
+                <w:sz w:val="18"/>
+                <w:szCs w:val="18"/>
+              </w:rPr>
+            </w:pPr>
+            <w:r>
+              <w:rPr>
+                <w:color w:val="000000"/>
+                <w:sz w:val="18"/>
+                <w:szCs w:val="18"/>
+              </w:rPr>
+              <w:t>{</w:t>
+            </w:r>
+            <w:proofErr w:type="spellStart"/>
+            <w:r>
+              <w:rPr>
+                <w:color w:val="000000"/>
+                <w:sz w:val="18"/>
+                <w:szCs w:val="18"/>
+              </w:rPr>
+              <w:t>posP</w:t>
+            </w:r>
+            <w:proofErr w:type="spellEnd"/>
+            <w:r>
+              <w:rPr>
+                <w:color w:val="000000"/>
+                <w:sz w:val="18"/>
+                <w:szCs w:val="18"/>
+              </w:rPr>
+              <w:t>}%</w:t>
+            </w:r>
+          </w:p>
+        </w:tc>
+        <w:tc>
+          <w:tcPr>
+            <w:tcW w:w="1006" w:type="dxa"/>
+          </w:tcPr>
+          <w:p>
+            <w:pPr>
+              <w:jc w:val="center"/>
+              <w:rPr>
+                <w:sz w:val="18"/>
+                <w:szCs w:val="18"/>
+              </w:rPr>
+            </w:pPr>
+            <w:r>
+              <w:rPr>
+                <w:color w:val="000000"/>
+                <w:sz w:val="18"/>
+                <w:szCs w:val="18"/>
+              </w:rPr>
+              <w:t>{</w:t>
+            </w:r>
+            <w:proofErr w:type="spellStart"/>
+            <w:r>
+              <w:rPr>
+                <w:color w:val="000000"/>
+                <w:sz w:val="18"/>
+                <w:szCs w:val="18"/>
+              </w:rPr>
+              <w:t>posC</w:t>
+            </w:r>
+            <w:proofErr w:type="spellEnd"/>
+            <w:r>
+              <w:rPr>
+                <w:color w:val="000000"/>
+                <w:sz w:val="18"/>
+                <w:szCs w:val="18"/>
+              </w:rPr>
+              <w:t>}{/</w:t>
+            </w:r>
+            <w:proofErr w:type="spellStart"/>
+            <w:r>
+              <w:rPr>
+                <w:color w:val="000000"/>
+                <w:sz w:val="18"/>
+                <w:szCs w:val="18"/>
+              </w:rPr>
+              <w:t>additional_genders</w:t>
+            </w:r>
+            <w:proofErr w:type="spellEnd"/>
+            <w:r>
+              <w:rPr>
+                <w:color w:val="000000"/>
+                <w:sz w:val="18"/>
+                <w:szCs w:val="18"/>
+              </w:rPr>
+              <w:t>}</w:t>
             </w:r>
           </w:p>
         </w:tc>
@@ -1000,28 +1281,28 @@
         <w:tblLook w:val="04A0" w:firstRow="1" w:lastRow="0" w:firstColumn="1" w:lastColumn="0" w:noHBand="0" w:noVBand="1"/>
       </w:tblPr>
       <w:tblGrid>
-        <w:gridCol w:w="1531"/>
-        <w:gridCol w:w="2952"/>
-        <w:gridCol w:w="2406"/>
-        <w:gridCol w:w="2461"/>
+        <w:gridCol w:w="1752"/>
+        <w:gridCol w:w="2296"/>
+        <w:gridCol w:w="2206"/>
+        <w:gridCol w:w="3096"/>
       </w:tblGrid>
       <w:tr>
         <w:tc>
           <w:tcPr>
-            <w:tcW w:w="1554" w:type="dxa"/>
-          </w:tcPr>
-          <w:p>
-            <w:pPr>
-              <w:rPr>
-                <w:sz w:val="18"/>
-                <w:szCs w:val="18"/>
-              </w:rPr>
-            </w:pPr>
-          </w:p>
-        </w:tc>
-        <w:tc>
-          <w:tcPr>
-            <w:tcW w:w="3169" w:type="dxa"/>
+            <w:tcW w:w="1531" w:type="dxa"/>
+          </w:tcPr>
+          <w:p>
+            <w:pPr>
+              <w:rPr>
+                <w:sz w:val="18"/>
+                <w:szCs w:val="18"/>
+              </w:rPr>
+            </w:pPr>
+          </w:p>
+        </w:tc>
+        <w:tc>
+          <w:tcPr>
+            <w:tcW w:w="2952" w:type="dxa"/>
           </w:tcPr>
           <w:p>
             <w:pPr>
@@ -1046,7 +1327,7 @@
         </w:tc>
         <w:tc>
           <w:tcPr>
-            <w:tcW w:w="2313" w:type="dxa"/>
+            <w:tcW w:w="2406" w:type="dxa"/>
           </w:tcPr>
           <w:p>
             <w:pPr>
@@ -1071,7 +1352,7 @@
         </w:tc>
         <w:tc>
           <w:tcPr>
-            <w:tcW w:w="2314" w:type="dxa"/>
+            <w:tcW w:w="2461" w:type="dxa"/>
           </w:tcPr>
           <w:p>
             <w:pPr>
@@ -1098,7 +1379,7 @@
       <w:tr>
         <w:tc>
           <w:tcPr>
-            <w:tcW w:w="1554" w:type="dxa"/>
+            <w:tcW w:w="1531" w:type="dxa"/>
           </w:tcPr>
           <w:p>
             <w:r>
@@ -1126,7 +1407,7 @@
         </w:tc>
         <w:tc>
           <w:tcPr>
-            <w:tcW w:w="3169" w:type="dxa"/>
+            <w:tcW w:w="2952" w:type="dxa"/>
           </w:tcPr>
           <w:p>
             <w:pPr>
@@ -1146,7 +1427,7 @@
         </w:tc>
         <w:tc>
           <w:tcPr>
-            <w:tcW w:w="2313" w:type="dxa"/>
+            <w:tcW w:w="2406" w:type="dxa"/>
           </w:tcPr>
           <w:p>
             <w:pPr>
@@ -1174,7 +1455,7 @@
         </w:tc>
         <w:tc>
           <w:tcPr>
-            <w:tcW w:w="2314" w:type="dxa"/>
+            <w:tcW w:w="2461" w:type="dxa"/>
           </w:tcPr>
           <w:p>
             <w:pPr>
@@ -1196,18 +1477,27 @@
       <w:tr>
         <w:tc>
           <w:tcPr>
-            <w:tcW w:w="1554" w:type="dxa"/>
-          </w:tcPr>
-          <w:p>
-            <w:r>
-              <w:rPr>
-                <w:sz w:val="18"/>
-                <w:szCs w:val="18"/>
-              </w:rPr>
-              <w:t>{gender_name</w:t>
-            </w:r>
-            <w:r>
-              <w:rPr>
+            <w:tcW w:w="1531" w:type="dxa"/>
+          </w:tcPr>
+          <w:p>
+            <w:r>
+              <w:rPr>
+                <w:sz w:val="18"/>
+                <w:szCs w:val="18"/>
+              </w:rPr>
+              <w:t>{gender_</w:t>
+            </w:r>
+            <w:r>
+              <w:rPr>
+                <w:rFonts w:ascii="Aptos" w:hAnsi="Aptos"/>
+                <w:sz w:val="18"/>
+                <w:szCs w:val="18"/>
+              </w:rPr>
+              <w:t>name</w:t>
+            </w:r>
+            <w:r>
+              <w:rPr>
+                <w:rFonts w:ascii="Aptos" w:hAnsi="Aptos"/>
                 <w:sz w:val="18"/>
                 <w:szCs w:val="18"/>
               </w:rPr>
@@ -1224,7 +1514,7 @@
         </w:tc>
         <w:tc>
           <w:tcPr>
-            <w:tcW w:w="3169" w:type="dxa"/>
+            <w:tcW w:w="2952" w:type="dxa"/>
           </w:tcPr>
           <w:p>
             <w:pPr>
@@ -1252,7 +1542,7 @@
         </w:tc>
         <w:tc>
           <w:tcPr>
-            <w:tcW w:w="2313" w:type="dxa"/>
+            <w:tcW w:w="2406" w:type="dxa"/>
           </w:tcPr>
           <w:p>
             <w:pPr>
@@ -1272,7 +1562,7 @@
         </w:tc>
         <w:tc>
           <w:tcPr>
-            <w:tcW w:w="2314" w:type="dxa"/>
+            <w:tcW w:w="2461" w:type="dxa"/>
           </w:tcPr>
           <w:p>
             <w:pPr>
@@ -1287,6 +1577,182 @@
                 <w:szCs w:val="18"/>
               </w:rPr>
               <w:t>{gender_summary_positive2}</w:t>
+            </w:r>
+          </w:p>
+        </w:tc>
+      </w:tr>
+      <w:tr>
+        <w:tc>
+          <w:tcPr>
+            <w:tcW w:w="1531" w:type="dxa"/>
+          </w:tcPr>
+          <w:p>
+            <w:pPr>
+              <w:rPr>
+                <w:rFonts w:ascii="Aptos" w:hAnsi="Aptos"/>
+                <w:sz w:val="20"/>
+                <w:szCs w:val="20"/>
+              </w:rPr>
+            </w:pPr>
+            <w:r>
+              <w:rPr>
+                <w:rFonts w:ascii="Aptos" w:hAnsi="Aptos"/>
+                <w:color w:val="000000"/>
+                <w:sz w:val="18"/>
+                <w:szCs w:val="18"/>
+              </w:rPr>
+              <w:t>{#additional_genders} {name}</w:t>
+            </w:r>
+          </w:p>
+        </w:tc>
+        <w:tc>
+          <w:tcPr>
+            <w:tcW w:w="2952" w:type="dxa"/>
+          </w:tcPr>
+          <w:p>
+            <w:pPr>
+              <w:rPr>
+                <w:sz w:val="18"/>
+                <w:szCs w:val="18"/>
+              </w:rPr>
+            </w:pPr>
+            <w:r>
+              <w:rPr>
+                <w:color w:val="000000"/>
+                <w:sz w:val="18"/>
+                <w:szCs w:val="18"/>
+              </w:rPr>
+              <w:t>{</w:t>
+            </w:r>
+            <w:proofErr w:type="spellStart"/>
+            <w:r>
+              <w:rPr>
+                <w:color w:val="000000"/>
+                <w:sz w:val="18"/>
+                <w:szCs w:val="18"/>
+              </w:rPr>
+              <w:t>summary_negative</w:t>
+            </w:r>
+            <w:proofErr w:type="spellEnd"/>
+            <w:r>
+              <w:rPr>
+                <w:color w:val="000000"/>
+                <w:sz w:val="18"/>
+                <w:szCs w:val="18"/>
+              </w:rPr>
+              <w:t>}</w:t>
+            </w:r>
+          </w:p>
+        </w:tc>
+        <w:tc>
+          <w:tcPr>
+            <w:tcW w:w="2406" w:type="dxa"/>
+          </w:tcPr>
+          <w:p>
+            <w:pPr>
+              <w:rPr>
+                <w:sz w:val="18"/>
+                <w:szCs w:val="18"/>
+              </w:rPr>
+            </w:pPr>
+            <w:r>
+              <w:rPr>
+                <w:color w:val="000000"/>
+                <w:sz w:val="18"/>
+                <w:szCs w:val="18"/>
+              </w:rPr>
+              <w:t>{</w:t>
+            </w:r>
+            <w:proofErr w:type="spellStart"/>
+            <w:r>
+              <w:rPr>
+                <w:color w:val="000000"/>
+                <w:sz w:val="18"/>
+                <w:szCs w:val="18"/>
+              </w:rPr>
+              <w:t>summary_ne</w:t>
+            </w:r>
+            <w:r>
+              <w:rPr>
+                <w:color w:val="000000"/>
+                <w:sz w:val="18"/>
+                <w:szCs w:val="18"/>
+              </w:rPr>
+              <w:t>utral</w:t>
+            </w:r>
+            <w:proofErr w:type="spellEnd"/>
+            <w:r>
+              <w:rPr>
+                <w:color w:val="000000"/>
+                <w:sz w:val="18"/>
+                <w:szCs w:val="18"/>
+              </w:rPr>
+              <w:t>}</w:t>
+            </w:r>
+          </w:p>
+        </w:tc>
+        <w:tc>
+          <w:tcPr>
+            <w:tcW w:w="2461" w:type="dxa"/>
+          </w:tcPr>
+          <w:p>
+            <w:pPr>
+              <w:rPr>
+                <w:sz w:val="18"/>
+                <w:szCs w:val="18"/>
+              </w:rPr>
+            </w:pPr>
+            <w:r>
+              <w:rPr>
+                <w:color w:val="000000"/>
+                <w:sz w:val="18"/>
+                <w:szCs w:val="18"/>
+              </w:rPr>
+              <w:t>{</w:t>
+            </w:r>
+            <w:proofErr w:type="spellStart"/>
+            <w:r>
+              <w:rPr>
+                <w:color w:val="000000"/>
+                <w:sz w:val="18"/>
+                <w:szCs w:val="18"/>
+              </w:rPr>
+              <w:t>summary_</w:t>
+            </w:r>
+            <w:r>
+              <w:rPr>
+                <w:color w:val="000000"/>
+                <w:sz w:val="18"/>
+                <w:szCs w:val="18"/>
+              </w:rPr>
+              <w:t>positive</w:t>
+            </w:r>
+            <w:proofErr w:type="spellEnd"/>
+            <w:r>
+              <w:rPr>
+                <w:color w:val="000000"/>
+                <w:sz w:val="18"/>
+                <w:szCs w:val="18"/>
+              </w:rPr>
+              <w:t>}{/</w:t>
+            </w:r>
+            <w:proofErr w:type="spellStart"/>
+            <w:r>
+              <w:rPr>
+                <w:color w:val="000000"/>
+                <w:sz w:val="18"/>
+                <w:szCs w:val="18"/>
+              </w:rPr>
+              <w:t>additional_genders</w:t>
+            </w:r>
+            <w:proofErr w:type="spellEnd"/>
+            <w:r>
+              <w:rPr>
+                <w:color w:val="000000"/>
+                <w:sz w:val="18"/>
+                <w:szCs w:val="18"/>
+              </w:rPr>
+              <w:t>}</w:t>
             </w:r>
           </w:p>
         </w:tc>
@@ -1315,13 +1781,13 @@
         <w:tblLook w:val="04A0" w:firstRow="1" w:lastRow="0" w:firstColumn="1" w:lastColumn="0" w:noHBand="0" w:noVBand="1"/>
       </w:tblPr>
       <w:tblGrid>
-        <w:gridCol w:w="1555"/>
-        <w:gridCol w:w="1419"/>
-        <w:gridCol w:w="1483"/>
-        <w:gridCol w:w="1458"/>
-        <w:gridCol w:w="1211"/>
-        <w:gridCol w:w="1216"/>
-        <w:gridCol w:w="1008"/>
+        <w:gridCol w:w="2295"/>
+        <w:gridCol w:w="998"/>
+        <w:gridCol w:w="880"/>
+        <w:gridCol w:w="1011"/>
+        <w:gridCol w:w="893"/>
+        <w:gridCol w:w="975"/>
+        <w:gridCol w:w="2298"/>
       </w:tblGrid>
       <w:tr>
         <w:tc>
@@ -2109,6 +2575,315 @@
                 <w:szCs w:val="18"/>
               </w:rPr>
               <w:t>{sPosC4}</w:t>
+            </w:r>
+          </w:p>
+        </w:tc>
+      </w:tr>
+      <w:tr>
+        <w:tc>
+          <w:tcPr>
+            <w:tcW w:w="1555" w:type="dxa"/>
+          </w:tcPr>
+          <w:p>
+            <w:pPr>
+              <w:rPr>
+                <w:rFonts w:ascii="Aptos" w:hAnsi="Aptos"/>
+                <w:sz w:val="18"/>
+                <w:szCs w:val="18"/>
+              </w:rPr>
+            </w:pPr>
+            <w:r>
+              <w:rPr>
+                <w:rFonts w:ascii="Aptos" w:hAnsi="Aptos"/>
+                <w:color w:val="000000"/>
+                <w:sz w:val="18"/>
+                <w:szCs w:val="18"/>
+              </w:rPr>
+              <w:t>{#additional_services}{name}</w:t>
+            </w:r>
+          </w:p>
+        </w:tc>
+        <w:tc>
+          <w:tcPr>
+            <w:tcW w:w="1419" w:type="dxa"/>
+          </w:tcPr>
+          <w:p>
+            <w:pPr>
+              <w:jc w:val="center"/>
+              <w:rPr>
+                <w:rFonts w:ascii="Aptos" w:hAnsi="Aptos"/>
+                <w:sz w:val="18"/>
+                <w:szCs w:val="18"/>
+              </w:rPr>
+            </w:pPr>
+            <w:r>
+              <w:rPr>
+                <w:rFonts w:ascii="Aptos" w:hAnsi="Aptos"/>
+                <w:color w:val="000000"/>
+                <w:sz w:val="18"/>
+                <w:szCs w:val="18"/>
+              </w:rPr>
+              <w:t>{</w:t>
+            </w:r>
+            <w:proofErr w:type="spellStart"/>
+            <w:r>
+              <w:rPr>
+                <w:rFonts w:ascii="Aptos" w:hAnsi="Aptos"/>
+                <w:color w:val="000000"/>
+                <w:sz w:val="18"/>
+                <w:szCs w:val="18"/>
+              </w:rPr>
+              <w:t>sNegP</w:t>
+            </w:r>
+            <w:proofErr w:type="spellEnd"/>
+            <w:r>
+              <w:rPr>
+                <w:rFonts w:ascii="Aptos" w:hAnsi="Aptos"/>
+                <w:color w:val="000000"/>
+                <w:sz w:val="18"/>
+                <w:szCs w:val="18"/>
+              </w:rPr>
+              <w:t>}%</w:t>
+            </w:r>
+          </w:p>
+        </w:tc>
+        <w:tc>
+          <w:tcPr>
+            <w:tcW w:w="1483" w:type="dxa"/>
+          </w:tcPr>
+          <w:p>
+            <w:pPr>
+              <w:jc w:val="center"/>
+              <w:rPr>
+                <w:rFonts w:ascii="Aptos" w:hAnsi="Aptos"/>
+                <w:sz w:val="18"/>
+                <w:szCs w:val="18"/>
+              </w:rPr>
+            </w:pPr>
+            <w:r>
+              <w:rPr>
+                <w:rFonts w:ascii="Aptos" w:hAnsi="Aptos"/>
+                <w:color w:val="000000"/>
+                <w:sz w:val="18"/>
+                <w:szCs w:val="18"/>
+              </w:rPr>
+              <w:t>{</w:t>
+            </w:r>
+            <w:proofErr w:type="spellStart"/>
+            <w:r>
+              <w:rPr>
+                <w:rFonts w:ascii="Aptos" w:hAnsi="Aptos"/>
+                <w:color w:val="000000"/>
+                <w:sz w:val="18"/>
+                <w:szCs w:val="18"/>
+              </w:rPr>
+              <w:t>sNegC</w:t>
+            </w:r>
+            <w:proofErr w:type="spellEnd"/>
+            <w:r>
+              <w:rPr>
+                <w:rFonts w:ascii="Aptos" w:hAnsi="Aptos"/>
+                <w:color w:val="000000"/>
+                <w:sz w:val="18"/>
+                <w:szCs w:val="18"/>
+              </w:rPr>
+              <w:t>}</w:t>
+            </w:r>
+          </w:p>
+        </w:tc>
+        <w:tc>
+          <w:tcPr>
+            <w:tcW w:w="1458" w:type="dxa"/>
+          </w:tcPr>
+          <w:p>
+            <w:pPr>
+              <w:jc w:val="center"/>
+              <w:rPr>
+                <w:rFonts w:ascii="Aptos" w:hAnsi="Aptos"/>
+                <w:sz w:val="18"/>
+                <w:szCs w:val="18"/>
+              </w:rPr>
+            </w:pPr>
+            <w:r>
+              <w:rPr>
+                <w:rFonts w:ascii="Aptos" w:hAnsi="Aptos"/>
+                <w:color w:val="000000"/>
+                <w:sz w:val="18"/>
+                <w:szCs w:val="18"/>
+              </w:rPr>
+              <w:t>{</w:t>
+            </w:r>
+            <w:proofErr w:type="spellStart"/>
+            <w:r>
+              <w:rPr>
+                <w:rFonts w:ascii="Aptos" w:hAnsi="Aptos"/>
+                <w:color w:val="000000"/>
+                <w:sz w:val="18"/>
+                <w:szCs w:val="18"/>
+              </w:rPr>
+              <w:t>sNeuP</w:t>
+            </w:r>
+            <w:proofErr w:type="spellEnd"/>
+            <w:r>
+              <w:rPr>
+                <w:rFonts w:ascii="Aptos" w:hAnsi="Aptos"/>
+                <w:color w:val="000000"/>
+                <w:sz w:val="18"/>
+                <w:szCs w:val="18"/>
+              </w:rPr>
+              <w:t>}%</w:t>
+            </w:r>
+          </w:p>
+        </w:tc>
+        <w:tc>
+          <w:tcPr>
+            <w:tcW w:w="1211" w:type="dxa"/>
+          </w:tcPr>
+          <w:p>
+            <w:pPr>
+              <w:jc w:val="center"/>
+              <w:rPr>
+                <w:rFonts w:ascii="Aptos" w:hAnsi="Aptos"/>
+                <w:sz w:val="18"/>
+                <w:szCs w:val="18"/>
+              </w:rPr>
+            </w:pPr>
+            <w:r>
+              <w:rPr>
+                <w:rFonts w:ascii="Aptos" w:hAnsi="Aptos"/>
+                <w:color w:val="000000"/>
+                <w:sz w:val="18"/>
+                <w:szCs w:val="18"/>
+              </w:rPr>
+              <w:t>{</w:t>
+            </w:r>
+            <w:proofErr w:type="spellStart"/>
+            <w:r>
+              <w:rPr>
+                <w:rFonts w:ascii="Aptos" w:hAnsi="Aptos"/>
+                <w:color w:val="000000"/>
+                <w:sz w:val="18"/>
+                <w:szCs w:val="18"/>
+              </w:rPr>
+              <w:t>sNeuC</w:t>
+            </w:r>
+            <w:proofErr w:type="spellEnd"/>
+            <w:r>
+              <w:rPr>
+                <w:rFonts w:ascii="Aptos" w:hAnsi="Aptos"/>
+                <w:color w:val="000000"/>
+                <w:sz w:val="18"/>
+                <w:szCs w:val="18"/>
+              </w:rPr>
+              <w:t>}</w:t>
+            </w:r>
+          </w:p>
+        </w:tc>
+        <w:tc>
+          <w:tcPr>
+            <w:tcW w:w="1216" w:type="dxa"/>
+          </w:tcPr>
+          <w:p>
+            <w:pPr>
+              <w:jc w:val="center"/>
+              <w:rPr>
+                <w:rFonts w:ascii="Aptos" w:hAnsi="Aptos"/>
+                <w:sz w:val="18"/>
+                <w:szCs w:val="18"/>
+              </w:rPr>
+            </w:pPr>
+            <w:r>
+              <w:rPr>
+                <w:rFonts w:ascii="Aptos" w:hAnsi="Aptos"/>
+                <w:color w:val="000000"/>
+                <w:sz w:val="18"/>
+                <w:szCs w:val="18"/>
+              </w:rPr>
+              <w:t>{</w:t>
+            </w:r>
+            <w:proofErr w:type="spellStart"/>
+            <w:r>
+              <w:rPr>
+                <w:rFonts w:ascii="Aptos" w:hAnsi="Aptos"/>
+                <w:color w:val="000000"/>
+                <w:sz w:val="18"/>
+                <w:szCs w:val="18"/>
+              </w:rPr>
+              <w:t>sPosP</w:t>
+            </w:r>
+            <w:proofErr w:type="spellEnd"/>
+            <w:r>
+              <w:rPr>
+                <w:rFonts w:ascii="Aptos" w:hAnsi="Aptos"/>
+                <w:color w:val="000000"/>
+                <w:sz w:val="18"/>
+                <w:szCs w:val="18"/>
+              </w:rPr>
+              <w:t>}%</w:t>
+            </w:r>
+          </w:p>
+        </w:tc>
+        <w:tc>
+          <w:tcPr>
+            <w:tcW w:w="1008" w:type="dxa"/>
+          </w:tcPr>
+          <w:p>
+            <w:pPr>
+              <w:jc w:val="center"/>
+              <w:rPr>
+                <w:rFonts w:ascii="Aptos" w:hAnsi="Aptos"/>
+                <w:sz w:val="18"/>
+                <w:szCs w:val="18"/>
+              </w:rPr>
+            </w:pPr>
+            <w:r>
+              <w:rPr>
+                <w:rFonts w:ascii="Aptos" w:hAnsi="Aptos"/>
+                <w:color w:val="000000"/>
+                <w:sz w:val="18"/>
+                <w:szCs w:val="18"/>
+              </w:rPr>
+              <w:t>{</w:t>
+            </w:r>
+            <w:proofErr w:type="spellStart"/>
+            <w:r>
+              <w:rPr>
+                <w:rFonts w:ascii="Aptos" w:hAnsi="Aptos"/>
+                <w:color w:val="000000"/>
+                <w:sz w:val="18"/>
+                <w:szCs w:val="18"/>
+              </w:rPr>
+              <w:t>sPosC</w:t>
+            </w:r>
+            <w:proofErr w:type="spellEnd"/>
+            <w:r>
+              <w:rPr>
+                <w:rFonts w:ascii="Aptos" w:hAnsi="Aptos"/>
+                <w:color w:val="000000"/>
+                <w:sz w:val="18"/>
+                <w:szCs w:val="18"/>
+              </w:rPr>
+              <w:t>}{/</w:t>
+            </w:r>
+            <w:proofErr w:type="spellStart"/>
+            <w:r>
+              <w:rPr>
+                <w:rFonts w:ascii="Aptos" w:hAnsi="Aptos"/>
+                <w:color w:val="000000"/>
+                <w:sz w:val="18"/>
+                <w:szCs w:val="18"/>
+              </w:rPr>
+              <w:t>additional_services</w:t>
+            </w:r>
+            <w:proofErr w:type="spellEnd"/>
+            <w:r>
+              <w:rPr>
+                <w:rFonts w:ascii="Aptos" w:hAnsi="Aptos"/>
+                <w:color w:val="000000"/>
+                <w:sz w:val="18"/>
+                <w:szCs w:val="18"/>
+              </w:rPr>
+              <w:t>}</w:t>
             </w:r>
           </w:p>
         </w:tc>
@@ -2153,10 +2928,10 @@
         <w:tblLook w:val="04A0" w:firstRow="1" w:lastRow="0" w:firstColumn="1" w:lastColumn="0" w:noHBand="0" w:noVBand="1"/>
       </w:tblPr>
       <w:tblGrid>
-        <w:gridCol w:w="1532"/>
-        <w:gridCol w:w="2856"/>
-        <w:gridCol w:w="2481"/>
-        <w:gridCol w:w="2481"/>
+        <w:gridCol w:w="2014"/>
+        <w:gridCol w:w="2053"/>
+        <w:gridCol w:w="2018"/>
+        <w:gridCol w:w="3265"/>
       </w:tblGrid>
       <w:tr>
         <w:tc>
@@ -2749,6 +3524,164 @@
                 <w:szCs w:val="18"/>
               </w:rPr>
             </w:pPr>
+          </w:p>
+        </w:tc>
+      </w:tr>
+      <w:tr>
+        <w:tc>
+          <w:tcPr>
+            <w:tcW w:w="1532" w:type="dxa"/>
+          </w:tcPr>
+          <w:p>
+            <w:pPr>
+              <w:rPr>
+                <w:sz w:val="18"/>
+                <w:szCs w:val="18"/>
+              </w:rPr>
+            </w:pPr>
+            <w:r>
+              <w:rPr>
+                <w:color w:val="000000"/>
+                <w:sz w:val="18"/>
+                <w:szCs w:val="18"/>
+              </w:rPr>
+              <w:t>{#additional_services}{name}</w:t>
+            </w:r>
+          </w:p>
+        </w:tc>
+        <w:tc>
+          <w:tcPr>
+            <w:tcW w:w="2856" w:type="dxa"/>
+          </w:tcPr>
+          <w:p>
+            <w:pPr>
+              <w:rPr>
+                <w:sz w:val="18"/>
+                <w:szCs w:val="18"/>
+              </w:rPr>
+            </w:pPr>
+            <w:r>
+              <w:rPr>
+                <w:color w:val="000000"/>
+                <w:sz w:val="18"/>
+                <w:szCs w:val="18"/>
+              </w:rPr>
+              <w:t>{</w:t>
+            </w:r>
+            <w:proofErr w:type="spellStart"/>
+            <w:r>
+              <w:rPr>
+                <w:color w:val="000000"/>
+                <w:sz w:val="18"/>
+                <w:szCs w:val="18"/>
+              </w:rPr>
+              <w:t>service_summary_negative</w:t>
+            </w:r>
+            <w:proofErr w:type="spellEnd"/>
+            <w:r>
+              <w:rPr>
+                <w:color w:val="000000"/>
+                <w:sz w:val="18"/>
+                <w:szCs w:val="18"/>
+              </w:rPr>
+              <w:t>}</w:t>
+            </w:r>
+          </w:p>
+        </w:tc>
+        <w:tc>
+          <w:tcPr>
+            <w:tcW w:w="2481" w:type="dxa"/>
+          </w:tcPr>
+          <w:p>
+            <w:pPr>
+              <w:rPr>
+                <w:sz w:val="18"/>
+                <w:szCs w:val="18"/>
+              </w:rPr>
+            </w:pPr>
+            <w:r>
+              <w:rPr>
+                <w:color w:val="000000"/>
+                <w:sz w:val="18"/>
+                <w:szCs w:val="18"/>
+              </w:rPr>
+              <w:t>{</w:t>
+            </w:r>
+            <w:proofErr w:type="spellStart"/>
+            <w:r>
+              <w:rPr>
+                <w:color w:val="000000"/>
+                <w:sz w:val="18"/>
+                <w:szCs w:val="18"/>
+              </w:rPr>
+              <w:t>service_summary_neutral</w:t>
+            </w:r>
+            <w:proofErr w:type="spellEnd"/>
+            <w:r>
+              <w:rPr>
+                <w:color w:val="000000"/>
+                <w:sz w:val="18"/>
+                <w:szCs w:val="18"/>
+              </w:rPr>
+              <w:t>}</w:t>
+            </w:r>
+          </w:p>
+        </w:tc>
+        <w:tc>
+          <w:tcPr>
+            <w:tcW w:w="2481" w:type="dxa"/>
+          </w:tcPr>
+          <w:p>
+            <w:pPr>
+              <w:rPr>
+                <w:sz w:val="18"/>
+                <w:szCs w:val="18"/>
+              </w:rPr>
+            </w:pPr>
+            <w:r>
+              <w:rPr>
+                <w:color w:val="000000"/>
+                <w:sz w:val="18"/>
+                <w:szCs w:val="18"/>
+              </w:rPr>
+              <w:t>{</w:t>
+            </w:r>
+            <w:proofErr w:type="spellStart"/>
+            <w:r>
+              <w:rPr>
+                <w:color w:val="000000"/>
+                <w:sz w:val="18"/>
+                <w:szCs w:val="18"/>
+              </w:rPr>
+              <w:t>service_summary_positive</w:t>
+            </w:r>
+            <w:proofErr w:type="spellEnd"/>
+            <w:r>
+              <w:rPr>
+                <w:color w:val="000000"/>
+                <w:sz w:val="18"/>
+                <w:szCs w:val="18"/>
+              </w:rPr>
+              <w:t>}{/</w:t>
+            </w:r>
+            <w:proofErr w:type="spellStart"/>
+            <w:r>
+              <w:rPr>
+                <w:color w:val="000000"/>
+                <w:sz w:val="18"/>
+                <w:szCs w:val="18"/>
+              </w:rPr>
+              <w:t>additional_services</w:t>
+            </w:r>
+            <w:proofErr w:type="spellEnd"/>
+            <w:r>
+              <w:rPr>
+                <w:color w:val="000000"/>
+                <w:sz w:val="18"/>
+                <w:szCs w:val="18"/>
+              </w:rPr>
+              <w:t>}</w:t>
+            </w:r>
           </w:p>
         </w:tc>
       </w:tr>

</xml_diff>

<commit_message>
Fix: Removed the fixed-index gender and service fields. restore the API's raw category values and order
</commit_message>
<xml_diff>
--- a/frontend/public/templates/ReportTemplate.docx
+++ b/frontend/public/templates/ReportTemplate.docx
@@ -371,18 +371,18 @@
         <w:tblLook w:val="04A0" w:firstRow="1" w:lastRow="0" w:firstColumn="1" w:lastColumn="0" w:noHBand="0" w:noVBand="1"/>
       </w:tblPr>
       <w:tblGrid>
-        <w:gridCol w:w="2407"/>
-        <w:gridCol w:w="964"/>
-        <w:gridCol w:w="878"/>
-        <w:gridCol w:w="977"/>
-        <w:gridCol w:w="852"/>
-        <w:gridCol w:w="942"/>
-        <w:gridCol w:w="2330"/>
+        <w:gridCol w:w="2455"/>
+        <w:gridCol w:w="938"/>
+        <w:gridCol w:w="893"/>
+        <w:gridCol w:w="937"/>
+        <w:gridCol w:w="823"/>
+        <w:gridCol w:w="928"/>
+        <w:gridCol w:w="2376"/>
       </w:tblGrid>
       <w:tr>
         <w:tc>
           <w:tcPr>
-            <w:tcW w:w="1482" w:type="dxa"/>
+            <w:tcW w:w="2455" w:type="dxa"/>
           </w:tcPr>
           <w:p>
             <w:pPr>
@@ -396,7 +396,7 @@
         </w:tc>
         <w:tc>
           <w:tcPr>
-            <w:tcW w:w="1517" w:type="dxa"/>
+            <w:tcW w:w="938" w:type="dxa"/>
           </w:tcPr>
           <w:p>
             <w:pPr>
@@ -417,7 +417,7 @@
         </w:tc>
         <w:tc>
           <w:tcPr>
-            <w:tcW w:w="1475" w:type="dxa"/>
+            <w:tcW w:w="893" w:type="dxa"/>
           </w:tcPr>
           <w:p>
             <w:pPr>
@@ -438,7 +438,7 @@
         </w:tc>
         <w:tc>
           <w:tcPr>
-            <w:tcW w:w="1452" w:type="dxa"/>
+            <w:tcW w:w="937" w:type="dxa"/>
           </w:tcPr>
           <w:p>
             <w:pPr>
@@ -459,7 +459,7 @@
         </w:tc>
         <w:tc>
           <w:tcPr>
-            <w:tcW w:w="1206" w:type="dxa"/>
+            <w:tcW w:w="823" w:type="dxa"/>
           </w:tcPr>
           <w:p>
             <w:pPr>
@@ -480,7 +480,7 @@
         </w:tc>
         <w:tc>
           <w:tcPr>
-            <w:tcW w:w="1212" w:type="dxa"/>
+            <w:tcW w:w="928" w:type="dxa"/>
           </w:tcPr>
           <w:p>
             <w:pPr>
@@ -501,7 +501,7 @@
         </w:tc>
         <w:tc>
           <w:tcPr>
-            <w:tcW w:w="1006" w:type="dxa"/>
+            <w:tcW w:w="2376" w:type="dxa"/>
           </w:tcPr>
           <w:p>
             <w:pPr>
@@ -524,29 +524,89 @@
       <w:tr>
         <w:tc>
           <w:tcPr>
-            <w:tcW w:w="1482" w:type="dxa"/>
-          </w:tcPr>
-          <w:p>
-            <w:pPr>
-              <w:rPr>
-                <w:sz w:val="18"/>
-                <w:szCs w:val="18"/>
-              </w:rPr>
-            </w:pPr>
-            <w:r>
-              <w:rPr>
-                <w:sz w:val="18"/>
-                <w:szCs w:val="18"/>
-              </w:rPr>
-              <w:t>{gender_name</w:t>
-            </w:r>
-            <w:r>
-              <w:rPr>
-                <w:sz w:val="18"/>
-                <w:szCs w:val="18"/>
-              </w:rPr>
-              <w:t>2</w:t>
-            </w:r>
+            <w:tcW w:w="2455" w:type="dxa"/>
+          </w:tcPr>
+          <w:p>
+            <w:pPr>
+              <w:rPr>
+                <w:sz w:val="18"/>
+                <w:szCs w:val="18"/>
+              </w:rPr>
+            </w:pPr>
+            <w:r>
+              <w:rPr>
+                <w:sz w:val="18"/>
+                <w:szCs w:val="18"/>
+              </w:rPr>
+              <w:t>{#genderRows}{name}</w:t>
+            </w:r>
+          </w:p>
+        </w:tc>
+        <w:tc>
+          <w:tcPr>
+            <w:tcW w:w="938" w:type="dxa"/>
+          </w:tcPr>
+          <w:p>
+            <w:pPr>
+              <w:jc w:val="center"/>
+              <w:rPr>
+                <w:sz w:val="18"/>
+                <w:szCs w:val="18"/>
+              </w:rPr>
+            </w:pPr>
+            <w:r>
+              <w:rPr>
+                <w:sz w:val="18"/>
+                <w:szCs w:val="18"/>
+              </w:rPr>
+              <w:t>{</w:t>
+            </w:r>
+            <w:proofErr w:type="spellStart"/>
+            <w:r>
+              <w:rPr>
+                <w:sz w:val="18"/>
+                <w:szCs w:val="18"/>
+              </w:rPr>
+              <w:t>negP</w:t>
+            </w:r>
+            <w:proofErr w:type="spellEnd"/>
+            <w:r>
+              <w:rPr>
+                <w:sz w:val="18"/>
+                <w:szCs w:val="18"/>
+              </w:rPr>
+              <w:t>}%</w:t>
+            </w:r>
+          </w:p>
+        </w:tc>
+        <w:tc>
+          <w:tcPr>
+            <w:tcW w:w="893" w:type="dxa"/>
+          </w:tcPr>
+          <w:p>
+            <w:pPr>
+              <w:jc w:val="center"/>
+              <w:rPr>
+                <w:sz w:val="18"/>
+                <w:szCs w:val="18"/>
+              </w:rPr>
+            </w:pPr>
+            <w:r>
+              <w:rPr>
+                <w:sz w:val="18"/>
+                <w:szCs w:val="18"/>
+              </w:rPr>
+              <w:t>{</w:t>
+            </w:r>
+            <w:proofErr w:type="spellStart"/>
+            <w:r>
+              <w:rPr>
+                <w:sz w:val="18"/>
+                <w:szCs w:val="18"/>
+              </w:rPr>
+              <w:t>negC</w:t>
+            </w:r>
+            <w:proofErr w:type="spellEnd"/>
             <w:r>
               <w:rPr>
                 <w:sz w:val="18"/>
@@ -558,7 +618,7 @@
         </w:tc>
         <w:tc>
           <w:tcPr>
-            <w:tcW w:w="1517" w:type="dxa"/>
+            <w:tcW w:w="937" w:type="dxa"/>
           </w:tcPr>
           <w:p>
             <w:pPr>
@@ -581,7 +641,7 @@
                 <w:sz w:val="18"/>
                 <w:szCs w:val="18"/>
               </w:rPr>
-              <w:t>NegP</w:t>
+              <w:t>neuP</w:t>
             </w:r>
             <w:proofErr w:type="spellEnd"/>
             <w:r>
@@ -595,7 +655,7 @@
         </w:tc>
         <w:tc>
           <w:tcPr>
-            <w:tcW w:w="1475" w:type="dxa"/>
+            <w:tcW w:w="823" w:type="dxa"/>
           </w:tcPr>
           <w:p>
             <w:pPr>
@@ -618,7 +678,7 @@
                 <w:sz w:val="18"/>
                 <w:szCs w:val="18"/>
               </w:rPr>
-              <w:t>NegC</w:t>
+              <w:t>neuC</w:t>
             </w:r>
             <w:proofErr w:type="spellEnd"/>
             <w:r>
@@ -632,7 +692,7 @@
         </w:tc>
         <w:tc>
           <w:tcPr>
-            <w:tcW w:w="1452" w:type="dxa"/>
+            <w:tcW w:w="928" w:type="dxa"/>
           </w:tcPr>
           <w:p>
             <w:pPr>
@@ -655,7 +715,7 @@
                 <w:sz w:val="18"/>
                 <w:szCs w:val="18"/>
               </w:rPr>
-              <w:t>NeuP</w:t>
+              <w:t>posP</w:t>
             </w:r>
             <w:proofErr w:type="spellEnd"/>
             <w:r>
@@ -669,7 +729,7 @@
         </w:tc>
         <w:tc>
           <w:tcPr>
-            <w:tcW w:w="1206" w:type="dxa"/>
+            <w:tcW w:w="2376" w:type="dxa"/>
           </w:tcPr>
           <w:p>
             <w:pPr>
@@ -692,7 +752,7 @@
                 <w:sz w:val="18"/>
                 <w:szCs w:val="18"/>
               </w:rPr>
-              <w:t>NeuC</w:t>
+              <w:t>posC</w:t>
             </w:r>
             <w:proofErr w:type="spellEnd"/>
             <w:r>
@@ -700,28 +760,7 @@
                 <w:sz w:val="18"/>
                 <w:szCs w:val="18"/>
               </w:rPr>
-              <w:t>}</w:t>
-            </w:r>
-          </w:p>
-        </w:tc>
-        <w:tc>
-          <w:tcPr>
-            <w:tcW w:w="1212" w:type="dxa"/>
-          </w:tcPr>
-          <w:p>
-            <w:pPr>
-              <w:jc w:val="center"/>
-              <w:rPr>
-                <w:sz w:val="18"/>
-                <w:szCs w:val="18"/>
-              </w:rPr>
-            </w:pPr>
-            <w:r>
-              <w:rPr>
-                <w:sz w:val="18"/>
-                <w:szCs w:val="18"/>
-              </w:rPr>
-              <w:t>{</w:t>
+              <w:t>}{/</w:t>
             </w:r>
             <w:proofErr w:type="spellStart"/>
             <w:r>
@@ -729,512 +768,11 @@
                 <w:sz w:val="18"/>
                 <w:szCs w:val="18"/>
               </w:rPr>
-              <w:t>posP</w:t>
+              <w:t>genderRows</w:t>
             </w:r>
             <w:proofErr w:type="spellEnd"/>
             <w:r>
               <w:rPr>
-                <w:sz w:val="18"/>
-                <w:szCs w:val="18"/>
-              </w:rPr>
-              <w:t>}%</w:t>
-            </w:r>
-          </w:p>
-        </w:tc>
-        <w:tc>
-          <w:tcPr>
-            <w:tcW w:w="1006" w:type="dxa"/>
-          </w:tcPr>
-          <w:p>
-            <w:pPr>
-              <w:jc w:val="center"/>
-              <w:rPr>
-                <w:sz w:val="18"/>
-                <w:szCs w:val="18"/>
-              </w:rPr>
-            </w:pPr>
-            <w:r>
-              <w:rPr>
-                <w:sz w:val="18"/>
-                <w:szCs w:val="18"/>
-              </w:rPr>
-              <w:t>{</w:t>
-            </w:r>
-            <w:proofErr w:type="spellStart"/>
-            <w:r>
-              <w:rPr>
-                <w:sz w:val="18"/>
-                <w:szCs w:val="18"/>
-              </w:rPr>
-              <w:t>posC</w:t>
-            </w:r>
-            <w:proofErr w:type="spellEnd"/>
-            <w:r>
-              <w:rPr>
-                <w:sz w:val="18"/>
-                <w:szCs w:val="18"/>
-              </w:rPr>
-              <w:t>}</w:t>
-            </w:r>
-          </w:p>
-        </w:tc>
-      </w:tr>
-      <w:tr>
-        <w:tc>
-          <w:tcPr>
-            <w:tcW w:w="1482" w:type="dxa"/>
-          </w:tcPr>
-          <w:p>
-            <w:pPr>
-              <w:rPr>
-                <w:sz w:val="18"/>
-                <w:szCs w:val="18"/>
-              </w:rPr>
-            </w:pPr>
-            <w:r>
-              <w:rPr>
-                <w:sz w:val="18"/>
-                <w:szCs w:val="18"/>
-              </w:rPr>
-              <w:t>{gender_name</w:t>
-            </w:r>
-            <w:r>
-              <w:rPr>
-                <w:sz w:val="18"/>
-                <w:szCs w:val="18"/>
-              </w:rPr>
-              <w:t>1</w:t>
-            </w:r>
-            <w:r>
-              <w:rPr>
-                <w:sz w:val="18"/>
-                <w:szCs w:val="18"/>
-              </w:rPr>
-              <w:t>}</w:t>
-            </w:r>
-          </w:p>
-        </w:tc>
-        <w:tc>
-          <w:tcPr>
-            <w:tcW w:w="1517" w:type="dxa"/>
-          </w:tcPr>
-          <w:p>
-            <w:pPr>
-              <w:jc w:val="center"/>
-              <w:rPr>
-                <w:sz w:val="18"/>
-                <w:szCs w:val="18"/>
-              </w:rPr>
-            </w:pPr>
-            <w:r>
-              <w:rPr>
-                <w:sz w:val="18"/>
-                <w:szCs w:val="18"/>
-              </w:rPr>
-              <w:t>{NegP2}%</w:t>
-            </w:r>
-          </w:p>
-        </w:tc>
-        <w:tc>
-          <w:tcPr>
-            <w:tcW w:w="1475" w:type="dxa"/>
-          </w:tcPr>
-          <w:p>
-            <w:pPr>
-              <w:jc w:val="center"/>
-              <w:rPr>
-                <w:sz w:val="18"/>
-                <w:szCs w:val="18"/>
-              </w:rPr>
-            </w:pPr>
-            <w:r>
-              <w:rPr>
-                <w:sz w:val="18"/>
-                <w:szCs w:val="18"/>
-              </w:rPr>
-              <w:t>{NegC</w:t>
-            </w:r>
-            <w:r>
-              <w:rPr>
-                <w:sz w:val="18"/>
-                <w:szCs w:val="18"/>
-              </w:rPr>
-              <w:t>2</w:t>
-            </w:r>
-            <w:r>
-              <w:rPr>
-                <w:sz w:val="18"/>
-                <w:szCs w:val="18"/>
-              </w:rPr>
-              <w:t>}</w:t>
-            </w:r>
-          </w:p>
-        </w:tc>
-        <w:tc>
-          <w:tcPr>
-            <w:tcW w:w="1452" w:type="dxa"/>
-          </w:tcPr>
-          <w:p>
-            <w:pPr>
-              <w:jc w:val="center"/>
-              <w:rPr>
-                <w:sz w:val="18"/>
-                <w:szCs w:val="18"/>
-              </w:rPr>
-            </w:pPr>
-            <w:r>
-              <w:rPr>
-                <w:sz w:val="18"/>
-                <w:szCs w:val="18"/>
-              </w:rPr>
-              <w:t>{NeuP2}%</w:t>
-            </w:r>
-          </w:p>
-        </w:tc>
-        <w:tc>
-          <w:tcPr>
-            <w:tcW w:w="1206" w:type="dxa"/>
-          </w:tcPr>
-          <w:p>
-            <w:pPr>
-              <w:jc w:val="center"/>
-              <w:rPr>
-                <w:sz w:val="18"/>
-                <w:szCs w:val="18"/>
-              </w:rPr>
-            </w:pPr>
-            <w:r>
-              <w:rPr>
-                <w:sz w:val="18"/>
-                <w:szCs w:val="18"/>
-              </w:rPr>
-              <w:t>{NeuC2}</w:t>
-            </w:r>
-          </w:p>
-        </w:tc>
-        <w:tc>
-          <w:tcPr>
-            <w:tcW w:w="1212" w:type="dxa"/>
-          </w:tcPr>
-          <w:p>
-            <w:pPr>
-              <w:jc w:val="center"/>
-              <w:rPr>
-                <w:sz w:val="18"/>
-                <w:szCs w:val="18"/>
-              </w:rPr>
-            </w:pPr>
-            <w:r>
-              <w:rPr>
-                <w:sz w:val="18"/>
-                <w:szCs w:val="18"/>
-              </w:rPr>
-              <w:t>{posP2}</w:t>
-            </w:r>
-            <w:r>
-              <w:rPr>
-                <w:sz w:val="18"/>
-                <w:szCs w:val="18"/>
-              </w:rPr>
-              <w:t>%</w:t>
-            </w:r>
-          </w:p>
-        </w:tc>
-        <w:tc>
-          <w:tcPr>
-            <w:tcW w:w="1006" w:type="dxa"/>
-          </w:tcPr>
-          <w:p>
-            <w:pPr>
-              <w:jc w:val="center"/>
-              <w:rPr>
-                <w:sz w:val="18"/>
-                <w:szCs w:val="18"/>
-              </w:rPr>
-            </w:pPr>
-            <w:r>
-              <w:rPr>
-                <w:sz w:val="18"/>
-                <w:szCs w:val="18"/>
-              </w:rPr>
-              <w:t>{posC2}</w:t>
-            </w:r>
-          </w:p>
-        </w:tc>
-      </w:tr>
-      <w:tr>
-        <w:tc>
-          <w:tcPr>
-            <w:tcW w:w="1482" w:type="dxa"/>
-          </w:tcPr>
-          <w:p>
-            <w:pPr>
-              <w:rPr>
-                <w:sz w:val="18"/>
-                <w:szCs w:val="18"/>
-              </w:rPr>
-            </w:pPr>
-            <w:r>
-              <w:rPr>
-                <w:color w:val="000000"/>
-                <w:sz w:val="18"/>
-                <w:szCs w:val="18"/>
-              </w:rPr>
-              <w:t>{#additional_genders}{name}</w:t>
-            </w:r>
-          </w:p>
-        </w:tc>
-        <w:tc>
-          <w:tcPr>
-            <w:tcW w:w="1517" w:type="dxa"/>
-          </w:tcPr>
-          <w:p>
-            <w:pPr>
-              <w:jc w:val="center"/>
-              <w:rPr>
-                <w:sz w:val="18"/>
-                <w:szCs w:val="18"/>
-              </w:rPr>
-            </w:pPr>
-            <w:r>
-              <w:rPr>
-                <w:color w:val="000000"/>
-                <w:sz w:val="18"/>
-                <w:szCs w:val="18"/>
-              </w:rPr>
-              <w:t>{</w:t>
-            </w:r>
-            <w:proofErr w:type="spellStart"/>
-            <w:r>
-              <w:rPr>
-                <w:color w:val="000000"/>
-                <w:sz w:val="18"/>
-                <w:szCs w:val="18"/>
-              </w:rPr>
-              <w:t>negP</w:t>
-            </w:r>
-            <w:proofErr w:type="spellEnd"/>
-            <w:r>
-              <w:rPr>
-                <w:color w:val="000000"/>
-                <w:sz w:val="18"/>
-                <w:szCs w:val="18"/>
-              </w:rPr>
-              <w:t>}%</w:t>
-            </w:r>
-          </w:p>
-        </w:tc>
-        <w:tc>
-          <w:tcPr>
-            <w:tcW w:w="1475" w:type="dxa"/>
-          </w:tcPr>
-          <w:p>
-            <w:pPr>
-              <w:jc w:val="center"/>
-              <w:rPr>
-                <w:sz w:val="18"/>
-                <w:szCs w:val="18"/>
-              </w:rPr>
-            </w:pPr>
-            <w:r>
-              <w:rPr>
-                <w:color w:val="000000"/>
-                <w:sz w:val="18"/>
-                <w:szCs w:val="18"/>
-              </w:rPr>
-              <w:t>{</w:t>
-            </w:r>
-            <w:proofErr w:type="spellStart"/>
-            <w:r>
-              <w:rPr>
-                <w:color w:val="000000"/>
-                <w:sz w:val="18"/>
-                <w:szCs w:val="18"/>
-              </w:rPr>
-              <w:t>negC</w:t>
-            </w:r>
-            <w:proofErr w:type="spellEnd"/>
-            <w:r>
-              <w:rPr>
-                <w:color w:val="000000"/>
-                <w:sz w:val="18"/>
-                <w:szCs w:val="18"/>
-              </w:rPr>
-              <w:t>}</w:t>
-            </w:r>
-          </w:p>
-        </w:tc>
-        <w:tc>
-          <w:tcPr>
-            <w:tcW w:w="1452" w:type="dxa"/>
-          </w:tcPr>
-          <w:p>
-            <w:pPr>
-              <w:jc w:val="center"/>
-              <w:rPr>
-                <w:sz w:val="18"/>
-                <w:szCs w:val="18"/>
-              </w:rPr>
-            </w:pPr>
-            <w:r>
-              <w:rPr>
-                <w:color w:val="000000"/>
-                <w:sz w:val="18"/>
-                <w:szCs w:val="18"/>
-              </w:rPr>
-              <w:t>{</w:t>
-            </w:r>
-            <w:proofErr w:type="spellStart"/>
-            <w:r>
-              <w:rPr>
-                <w:color w:val="000000"/>
-                <w:sz w:val="18"/>
-                <w:szCs w:val="18"/>
-              </w:rPr>
-              <w:t>neuP</w:t>
-            </w:r>
-            <w:proofErr w:type="spellEnd"/>
-            <w:r>
-              <w:rPr>
-                <w:color w:val="000000"/>
-                <w:sz w:val="18"/>
-                <w:szCs w:val="18"/>
-              </w:rPr>
-              <w:t>}%</w:t>
-            </w:r>
-          </w:p>
-        </w:tc>
-        <w:tc>
-          <w:tcPr>
-            <w:tcW w:w="1206" w:type="dxa"/>
-          </w:tcPr>
-          <w:p>
-            <w:pPr>
-              <w:jc w:val="center"/>
-              <w:rPr>
-                <w:sz w:val="18"/>
-                <w:szCs w:val="18"/>
-              </w:rPr>
-            </w:pPr>
-            <w:r>
-              <w:rPr>
-                <w:color w:val="000000"/>
-                <w:sz w:val="18"/>
-                <w:szCs w:val="18"/>
-              </w:rPr>
-              <w:t>{</w:t>
-            </w:r>
-            <w:proofErr w:type="spellStart"/>
-            <w:r>
-              <w:rPr>
-                <w:color w:val="000000"/>
-                <w:sz w:val="18"/>
-                <w:szCs w:val="18"/>
-              </w:rPr>
-              <w:t>neuC</w:t>
-            </w:r>
-            <w:proofErr w:type="spellEnd"/>
-            <w:r>
-              <w:rPr>
-                <w:color w:val="000000"/>
-                <w:sz w:val="18"/>
-                <w:szCs w:val="18"/>
-              </w:rPr>
-              <w:t>}</w:t>
-            </w:r>
-          </w:p>
-        </w:tc>
-        <w:tc>
-          <w:tcPr>
-            <w:tcW w:w="1212" w:type="dxa"/>
-          </w:tcPr>
-          <w:p>
-            <w:pPr>
-              <w:jc w:val="center"/>
-              <w:rPr>
-                <w:sz w:val="18"/>
-                <w:szCs w:val="18"/>
-              </w:rPr>
-            </w:pPr>
-            <w:r>
-              <w:rPr>
-                <w:color w:val="000000"/>
-                <w:sz w:val="18"/>
-                <w:szCs w:val="18"/>
-              </w:rPr>
-              <w:t>{</w:t>
-            </w:r>
-            <w:proofErr w:type="spellStart"/>
-            <w:r>
-              <w:rPr>
-                <w:color w:val="000000"/>
-                <w:sz w:val="18"/>
-                <w:szCs w:val="18"/>
-              </w:rPr>
-              <w:t>posP</w:t>
-            </w:r>
-            <w:proofErr w:type="spellEnd"/>
-            <w:r>
-              <w:rPr>
-                <w:color w:val="000000"/>
-                <w:sz w:val="18"/>
-                <w:szCs w:val="18"/>
-              </w:rPr>
-              <w:t>}%</w:t>
-            </w:r>
-          </w:p>
-        </w:tc>
-        <w:tc>
-          <w:tcPr>
-            <w:tcW w:w="1006" w:type="dxa"/>
-          </w:tcPr>
-          <w:p>
-            <w:pPr>
-              <w:jc w:val="center"/>
-              <w:rPr>
-                <w:sz w:val="18"/>
-                <w:szCs w:val="18"/>
-              </w:rPr>
-            </w:pPr>
-            <w:r>
-              <w:rPr>
-                <w:color w:val="000000"/>
-                <w:sz w:val="18"/>
-                <w:szCs w:val="18"/>
-              </w:rPr>
-              <w:t>{</w:t>
-            </w:r>
-            <w:proofErr w:type="spellStart"/>
-            <w:r>
-              <w:rPr>
-                <w:color w:val="000000"/>
-                <w:sz w:val="18"/>
-                <w:szCs w:val="18"/>
-              </w:rPr>
-              <w:t>posC</w:t>
-            </w:r>
-            <w:proofErr w:type="spellEnd"/>
-            <w:r>
-              <w:rPr>
-                <w:color w:val="000000"/>
-                <w:sz w:val="18"/>
-                <w:szCs w:val="18"/>
-              </w:rPr>
-              <w:t>}{/</w:t>
-            </w:r>
-            <w:proofErr w:type="spellStart"/>
-            <w:r>
-              <w:rPr>
-                <w:color w:val="000000"/>
-                <w:sz w:val="18"/>
-                <w:szCs w:val="18"/>
-              </w:rPr>
-              <w:t>additional_genders</w:t>
-            </w:r>
-            <w:proofErr w:type="spellEnd"/>
-            <w:r>
-              <w:rPr>
-                <w:color w:val="000000"/>
                 <w:sz w:val="18"/>
                 <w:szCs w:val="18"/>
               </w:rPr>
@@ -1281,28 +819,28 @@
         <w:tblLook w:val="04A0" w:firstRow="1" w:lastRow="0" w:firstColumn="1" w:lastColumn="0" w:noHBand="0" w:noVBand="1"/>
       </w:tblPr>
       <w:tblGrid>
-        <w:gridCol w:w="1752"/>
-        <w:gridCol w:w="2296"/>
-        <w:gridCol w:w="2206"/>
-        <w:gridCol w:w="3096"/>
+        <w:gridCol w:w="2456"/>
+        <w:gridCol w:w="1800"/>
+        <w:gridCol w:w="1700"/>
+        <w:gridCol w:w="3394"/>
       </w:tblGrid>
       <w:tr>
         <w:tc>
           <w:tcPr>
-            <w:tcW w:w="1531" w:type="dxa"/>
-          </w:tcPr>
-          <w:p>
-            <w:pPr>
-              <w:rPr>
-                <w:sz w:val="18"/>
-                <w:szCs w:val="18"/>
-              </w:rPr>
-            </w:pPr>
-          </w:p>
-        </w:tc>
-        <w:tc>
-          <w:tcPr>
-            <w:tcW w:w="2952" w:type="dxa"/>
+            <w:tcW w:w="2456" w:type="dxa"/>
+          </w:tcPr>
+          <w:p>
+            <w:pPr>
+              <w:rPr>
+                <w:sz w:val="18"/>
+                <w:szCs w:val="18"/>
+              </w:rPr>
+            </w:pPr>
+          </w:p>
+        </w:tc>
+        <w:tc>
+          <w:tcPr>
+            <w:tcW w:w="1800" w:type="dxa"/>
           </w:tcPr>
           <w:p>
             <w:pPr>
@@ -1327,7 +865,7 @@
         </w:tc>
         <w:tc>
           <w:tcPr>
-            <w:tcW w:w="2406" w:type="dxa"/>
+            <w:tcW w:w="1700" w:type="dxa"/>
           </w:tcPr>
           <w:p>
             <w:pPr>
@@ -1352,7 +890,7 @@
         </w:tc>
         <w:tc>
           <w:tcPr>
-            <w:tcW w:w="2461" w:type="dxa"/>
+            <w:tcW w:w="3394" w:type="dxa"/>
           </w:tcPr>
           <w:p>
             <w:pPr>
@@ -1379,23 +917,51 @@
       <w:tr>
         <w:tc>
           <w:tcPr>
-            <w:tcW w:w="1531" w:type="dxa"/>
-          </w:tcPr>
-          <w:p>
-            <w:r>
-              <w:rPr>
-                <w:sz w:val="18"/>
-                <w:szCs w:val="18"/>
-              </w:rPr>
-              <w:t>{gender_name</w:t>
-            </w:r>
-            <w:r>
-              <w:rPr>
-                <w:sz w:val="18"/>
-                <w:szCs w:val="18"/>
-              </w:rPr>
-              <w:t>2</w:t>
-            </w:r>
+            <w:tcW w:w="2456" w:type="dxa"/>
+          </w:tcPr>
+          <w:p>
+            <w:pPr>
+              <w:rPr>
+                <w:sz w:val="18"/>
+                <w:szCs w:val="18"/>
+              </w:rPr>
+            </w:pPr>
+            <w:r>
+              <w:rPr>
+                <w:sz w:val="18"/>
+                <w:szCs w:val="18"/>
+              </w:rPr>
+              <w:t>{#genderTooltipRows}{name}</w:t>
+            </w:r>
+          </w:p>
+        </w:tc>
+        <w:tc>
+          <w:tcPr>
+            <w:tcW w:w="1800" w:type="dxa"/>
+          </w:tcPr>
+          <w:p>
+            <w:pPr>
+              <w:rPr>
+                <w:sz w:val="18"/>
+                <w:szCs w:val="18"/>
+              </w:rPr>
+            </w:pPr>
+            <w:r>
+              <w:rPr>
+                <w:sz w:val="18"/>
+                <w:szCs w:val="18"/>
+              </w:rPr>
+              <w:t>{</w:t>
+            </w:r>
+            <w:proofErr w:type="spellStart"/>
+            <w:r>
+              <w:rPr>
+                <w:sz w:val="18"/>
+                <w:szCs w:val="18"/>
+              </w:rPr>
+              <w:t>summary_negative</w:t>
+            </w:r>
+            <w:proofErr w:type="spellEnd"/>
             <w:r>
               <w:rPr>
                 <w:sz w:val="18"/>
@@ -1407,102 +973,31 @@
         </w:tc>
         <w:tc>
           <w:tcPr>
-            <w:tcW w:w="2952" w:type="dxa"/>
-          </w:tcPr>
-          <w:p>
-            <w:pPr>
-              <w:rPr>
-                <w:sz w:val="18"/>
-                <w:szCs w:val="18"/>
-              </w:rPr>
-            </w:pPr>
-            <w:r>
-              <w:rPr>
-                <w:sz w:val="18"/>
-                <w:szCs w:val="18"/>
-              </w:rPr>
-              <w:t>{gender_summary_negative1}</w:t>
-            </w:r>
-          </w:p>
-        </w:tc>
-        <w:tc>
-          <w:tcPr>
-            <w:tcW w:w="2406" w:type="dxa"/>
-          </w:tcPr>
-          <w:p>
-            <w:pPr>
-              <w:rPr>
-                <w:sz w:val="18"/>
-                <w:szCs w:val="18"/>
-              </w:rPr>
-            </w:pPr>
-            <w:r>
-              <w:rPr>
-                <w:sz w:val="18"/>
-                <w:szCs w:val="18"/>
-              </w:rPr>
-              <w:t>{gender_summary_neutral1}</w:t>
-            </w:r>
-          </w:p>
-          <w:p>
-            <w:pPr>
-              <w:rPr>
-                <w:sz w:val="18"/>
-                <w:szCs w:val="18"/>
-              </w:rPr>
-            </w:pPr>
-          </w:p>
-        </w:tc>
-        <w:tc>
-          <w:tcPr>
-            <w:tcW w:w="2461" w:type="dxa"/>
-          </w:tcPr>
-          <w:p>
-            <w:pPr>
-              <w:rPr>
-                <w:sz w:val="18"/>
-                <w:szCs w:val="18"/>
-              </w:rPr>
-            </w:pPr>
-            <w:r>
-              <w:rPr>
-                <w:sz w:val="18"/>
-                <w:szCs w:val="18"/>
-              </w:rPr>
-              <w:t>{gender_summary_positive1}</w:t>
-            </w:r>
-          </w:p>
-        </w:tc>
-      </w:tr>
-      <w:tr>
-        <w:tc>
-          <w:tcPr>
-            <w:tcW w:w="1531" w:type="dxa"/>
-          </w:tcPr>
-          <w:p>
-            <w:r>
-              <w:rPr>
-                <w:sz w:val="18"/>
-                <w:szCs w:val="18"/>
-              </w:rPr>
-              <w:t>{gender_</w:t>
-            </w:r>
-            <w:r>
-              <w:rPr>
-                <w:rFonts w:ascii="Aptos" w:hAnsi="Aptos"/>
-                <w:sz w:val="18"/>
-                <w:szCs w:val="18"/>
-              </w:rPr>
-              <w:t>name</w:t>
-            </w:r>
-            <w:r>
-              <w:rPr>
-                <w:rFonts w:ascii="Aptos" w:hAnsi="Aptos"/>
-                <w:sz w:val="18"/>
-                <w:szCs w:val="18"/>
-              </w:rPr>
-              <w:t>1</w:t>
-            </w:r>
+            <w:tcW w:w="1700" w:type="dxa"/>
+          </w:tcPr>
+          <w:p>
+            <w:pPr>
+              <w:rPr>
+                <w:sz w:val="18"/>
+                <w:szCs w:val="18"/>
+              </w:rPr>
+            </w:pPr>
+            <w:r>
+              <w:rPr>
+                <w:sz w:val="18"/>
+                <w:szCs w:val="18"/>
+              </w:rPr>
+              <w:t>{</w:t>
+            </w:r>
+            <w:proofErr w:type="spellStart"/>
+            <w:r>
+              <w:rPr>
+                <w:sz w:val="18"/>
+                <w:szCs w:val="18"/>
+              </w:rPr>
+              <w:t>summary_neutral</w:t>
+            </w:r>
+            <w:proofErr w:type="spellEnd"/>
             <w:r>
               <w:rPr>
                 <w:sz w:val="18"/>
@@ -1514,111 +1009,17 @@
         </w:tc>
         <w:tc>
           <w:tcPr>
-            <w:tcW w:w="2952" w:type="dxa"/>
-          </w:tcPr>
-          <w:p>
-            <w:pPr>
-              <w:rPr>
-                <w:sz w:val="18"/>
-                <w:szCs w:val="18"/>
-              </w:rPr>
-            </w:pPr>
-            <w:r>
-              <w:rPr>
-                <w:sz w:val="18"/>
-                <w:szCs w:val="18"/>
-              </w:rPr>
-              <w:t>{gender_summary_negative2}</w:t>
-            </w:r>
-          </w:p>
-          <w:p>
-            <w:pPr>
-              <w:rPr>
-                <w:sz w:val="18"/>
-                <w:szCs w:val="18"/>
-              </w:rPr>
-            </w:pPr>
-          </w:p>
-        </w:tc>
-        <w:tc>
-          <w:tcPr>
-            <w:tcW w:w="2406" w:type="dxa"/>
-          </w:tcPr>
-          <w:p>
-            <w:pPr>
-              <w:rPr>
-                <w:sz w:val="18"/>
-                <w:szCs w:val="18"/>
-              </w:rPr>
-            </w:pPr>
-            <w:r>
-              <w:rPr>
-                <w:sz w:val="18"/>
-                <w:szCs w:val="18"/>
-              </w:rPr>
-              <w:t>{gender_summary_neutral2}</w:t>
-            </w:r>
-          </w:p>
-        </w:tc>
-        <w:tc>
-          <w:tcPr>
-            <w:tcW w:w="2461" w:type="dxa"/>
-          </w:tcPr>
-          <w:p>
-            <w:pPr>
-              <w:rPr>
-                <w:sz w:val="18"/>
-                <w:szCs w:val="18"/>
-              </w:rPr>
-            </w:pPr>
-            <w:r>
-              <w:rPr>
-                <w:sz w:val="18"/>
-                <w:szCs w:val="18"/>
-              </w:rPr>
-              <w:t>{gender_summary_positive2}</w:t>
-            </w:r>
-          </w:p>
-        </w:tc>
-      </w:tr>
-      <w:tr>
-        <w:tc>
-          <w:tcPr>
-            <w:tcW w:w="1531" w:type="dxa"/>
-          </w:tcPr>
-          <w:p>
-            <w:pPr>
-              <w:rPr>
-                <w:rFonts w:ascii="Aptos" w:hAnsi="Aptos"/>
-                <w:sz w:val="20"/>
-                <w:szCs w:val="20"/>
-              </w:rPr>
-            </w:pPr>
-            <w:r>
-              <w:rPr>
-                <w:rFonts w:ascii="Aptos" w:hAnsi="Aptos"/>
-                <w:color w:val="000000"/>
-                <w:sz w:val="18"/>
-                <w:szCs w:val="18"/>
-              </w:rPr>
-              <w:t>{#additional_genders} {name}</w:t>
-            </w:r>
-          </w:p>
-        </w:tc>
-        <w:tc>
-          <w:tcPr>
-            <w:tcW w:w="2952" w:type="dxa"/>
-          </w:tcPr>
-          <w:p>
-            <w:pPr>
-              <w:rPr>
-                <w:sz w:val="18"/>
-                <w:szCs w:val="18"/>
-              </w:rPr>
-            </w:pPr>
-            <w:r>
-              <w:rPr>
-                <w:color w:val="000000"/>
+            <w:tcW w:w="3394" w:type="dxa"/>
+          </w:tcPr>
+          <w:p>
+            <w:pPr>
+              <w:rPr>
+                <w:sz w:val="18"/>
+                <w:szCs w:val="18"/>
+              </w:rPr>
+            </w:pPr>
+            <w:r>
+              <w:rPr>
                 <w:sz w:val="18"/>
                 <w:szCs w:val="18"/>
               </w:rPr>
@@ -1627,128 +1028,30 @@
             <w:proofErr w:type="spellStart"/>
             <w:r>
               <w:rPr>
-                <w:color w:val="000000"/>
-                <w:sz w:val="18"/>
-                <w:szCs w:val="18"/>
-              </w:rPr>
-              <w:t>summary_negative</w:t>
+                <w:sz w:val="18"/>
+                <w:szCs w:val="18"/>
+              </w:rPr>
+              <w:t>summary_positive</w:t>
             </w:r>
             <w:proofErr w:type="spellEnd"/>
             <w:r>
               <w:rPr>
-                <w:color w:val="000000"/>
-                <w:sz w:val="18"/>
-                <w:szCs w:val="18"/>
-              </w:rPr>
-              <w:t>}</w:t>
-            </w:r>
-          </w:p>
-        </w:tc>
-        <w:tc>
-          <w:tcPr>
-            <w:tcW w:w="2406" w:type="dxa"/>
-          </w:tcPr>
-          <w:p>
-            <w:pPr>
-              <w:rPr>
-                <w:sz w:val="18"/>
-                <w:szCs w:val="18"/>
-              </w:rPr>
-            </w:pPr>
-            <w:r>
-              <w:rPr>
-                <w:color w:val="000000"/>
-                <w:sz w:val="18"/>
-                <w:szCs w:val="18"/>
-              </w:rPr>
-              <w:t>{</w:t>
+                <w:sz w:val="18"/>
+                <w:szCs w:val="18"/>
+              </w:rPr>
+              <w:t>}{/</w:t>
             </w:r>
             <w:proofErr w:type="spellStart"/>
             <w:r>
               <w:rPr>
-                <w:color w:val="000000"/>
-                <w:sz w:val="18"/>
-                <w:szCs w:val="18"/>
-              </w:rPr>
-              <w:t>summary_ne</w:t>
-            </w:r>
-            <w:r>
-              <w:rPr>
-                <w:color w:val="000000"/>
-                <w:sz w:val="18"/>
-                <w:szCs w:val="18"/>
-              </w:rPr>
-              <w:t>utral</w:t>
+                <w:sz w:val="18"/>
+                <w:szCs w:val="18"/>
+              </w:rPr>
+              <w:t>genderTooltipRows</w:t>
             </w:r>
             <w:proofErr w:type="spellEnd"/>
             <w:r>
               <w:rPr>
-                <w:color w:val="000000"/>
-                <w:sz w:val="18"/>
-                <w:szCs w:val="18"/>
-              </w:rPr>
-              <w:t>}</w:t>
-            </w:r>
-          </w:p>
-        </w:tc>
-        <w:tc>
-          <w:tcPr>
-            <w:tcW w:w="2461" w:type="dxa"/>
-          </w:tcPr>
-          <w:p>
-            <w:pPr>
-              <w:rPr>
-                <w:sz w:val="18"/>
-                <w:szCs w:val="18"/>
-              </w:rPr>
-            </w:pPr>
-            <w:r>
-              <w:rPr>
-                <w:color w:val="000000"/>
-                <w:sz w:val="18"/>
-                <w:szCs w:val="18"/>
-              </w:rPr>
-              <w:t>{</w:t>
-            </w:r>
-            <w:proofErr w:type="spellStart"/>
-            <w:r>
-              <w:rPr>
-                <w:color w:val="000000"/>
-                <w:sz w:val="18"/>
-                <w:szCs w:val="18"/>
-              </w:rPr>
-              <w:t>summary_</w:t>
-            </w:r>
-            <w:r>
-              <w:rPr>
-                <w:color w:val="000000"/>
-                <w:sz w:val="18"/>
-                <w:szCs w:val="18"/>
-              </w:rPr>
-              <w:t>positive</w:t>
-            </w:r>
-            <w:proofErr w:type="spellEnd"/>
-            <w:r>
-              <w:rPr>
-                <w:color w:val="000000"/>
-                <w:sz w:val="18"/>
-                <w:szCs w:val="18"/>
-              </w:rPr>
-              <w:t>}{/</w:t>
-            </w:r>
-            <w:proofErr w:type="spellStart"/>
-            <w:r>
-              <w:rPr>
-                <w:color w:val="000000"/>
-                <w:sz w:val="18"/>
-                <w:szCs w:val="18"/>
-              </w:rPr>
-              <w:t>additional_genders</w:t>
-            </w:r>
-            <w:proofErr w:type="spellEnd"/>
-            <w:r>
-              <w:rPr>
-                <w:color w:val="000000"/>
                 <w:sz w:val="18"/>
                 <w:szCs w:val="18"/>
               </w:rPr>
@@ -1781,18 +1084,18 @@
         <w:tblLook w:val="04A0" w:firstRow="1" w:lastRow="0" w:firstColumn="1" w:lastColumn="0" w:noHBand="0" w:noVBand="1"/>
       </w:tblPr>
       <w:tblGrid>
-        <w:gridCol w:w="2295"/>
-        <w:gridCol w:w="998"/>
-        <w:gridCol w:w="880"/>
-        <w:gridCol w:w="1011"/>
+        <w:gridCol w:w="2347"/>
+        <w:gridCol w:w="971"/>
         <w:gridCol w:w="893"/>
-        <w:gridCol w:w="975"/>
-        <w:gridCol w:w="2298"/>
+        <w:gridCol w:w="985"/>
+        <w:gridCol w:w="857"/>
+        <w:gridCol w:w="945"/>
+        <w:gridCol w:w="2352"/>
       </w:tblGrid>
       <w:tr>
         <w:tc>
           <w:tcPr>
-            <w:tcW w:w="1555" w:type="dxa"/>
+            <w:tcW w:w="2405" w:type="dxa"/>
           </w:tcPr>
           <w:p>
             <w:pPr>
@@ -1806,7 +1109,7 @@
         </w:tc>
         <w:tc>
           <w:tcPr>
-            <w:tcW w:w="1419" w:type="dxa"/>
+            <w:tcW w:w="947" w:type="dxa"/>
           </w:tcPr>
           <w:p>
             <w:pPr>
@@ -1827,7 +1130,7 @@
         </w:tc>
         <w:tc>
           <w:tcPr>
-            <w:tcW w:w="1483" w:type="dxa"/>
+            <w:tcW w:w="871" w:type="dxa"/>
           </w:tcPr>
           <w:p>
             <w:pPr>
@@ -1848,7 +1151,7 @@
         </w:tc>
         <w:tc>
           <w:tcPr>
-            <w:tcW w:w="1458" w:type="dxa"/>
+            <w:tcW w:w="960" w:type="dxa"/>
           </w:tcPr>
           <w:p>
             <w:pPr>
@@ -1869,7 +1172,7 @@
         </w:tc>
         <w:tc>
           <w:tcPr>
-            <w:tcW w:w="1211" w:type="dxa"/>
+            <w:tcW w:w="836" w:type="dxa"/>
           </w:tcPr>
           <w:p>
             <w:pPr>
@@ -1890,7 +1193,7 @@
         </w:tc>
         <w:tc>
           <w:tcPr>
-            <w:tcW w:w="1216" w:type="dxa"/>
+            <w:tcW w:w="922" w:type="dxa"/>
           </w:tcPr>
           <w:p>
             <w:pPr>
@@ -1911,7 +1214,7 @@
         </w:tc>
         <w:tc>
           <w:tcPr>
-            <w:tcW w:w="1008" w:type="dxa"/>
+            <w:tcW w:w="2409" w:type="dxa"/>
           </w:tcPr>
           <w:p>
             <w:pPr>
@@ -1934,10 +1237,31 @@
       <w:tr>
         <w:tc>
           <w:tcPr>
-            <w:tcW w:w="1555" w:type="dxa"/>
-          </w:tcPr>
-          <w:p>
-            <w:pPr>
+            <w:tcW w:w="2405" w:type="dxa"/>
+          </w:tcPr>
+          <w:p>
+            <w:pPr>
+              <w:rPr>
+                <w:sz w:val="18"/>
+                <w:szCs w:val="18"/>
+              </w:rPr>
+            </w:pPr>
+            <w:r>
+              <w:rPr>
+                <w:sz w:val="18"/>
+                <w:szCs w:val="18"/>
+              </w:rPr>
+              <w:t>{#serviceRows}{name}</w:t>
+            </w:r>
+          </w:p>
+        </w:tc>
+        <w:tc>
+          <w:tcPr>
+            <w:tcW w:w="947" w:type="dxa"/>
+          </w:tcPr>
+          <w:p>
+            <w:pPr>
+              <w:jc w:val="center"/>
               <w:rPr>
                 <w:sz w:val="18"/>
                 <w:szCs w:val="18"/>
@@ -1950,13 +1274,52 @@
               </w:rPr>
               <w:t>{</w:t>
             </w:r>
-            <w:r>
-              <w:rPr>
-                <w:sz w:val="18"/>
-                <w:szCs w:val="18"/>
-              </w:rPr>
-              <w:t>service_name1</w:t>
-            </w:r>
+            <w:proofErr w:type="spellStart"/>
+            <w:r>
+              <w:rPr>
+                <w:sz w:val="18"/>
+                <w:szCs w:val="18"/>
+              </w:rPr>
+              <w:t>sNegP</w:t>
+            </w:r>
+            <w:proofErr w:type="spellEnd"/>
+            <w:r>
+              <w:rPr>
+                <w:sz w:val="18"/>
+                <w:szCs w:val="18"/>
+              </w:rPr>
+              <w:t>}%</w:t>
+            </w:r>
+          </w:p>
+        </w:tc>
+        <w:tc>
+          <w:tcPr>
+            <w:tcW w:w="871" w:type="dxa"/>
+          </w:tcPr>
+          <w:p>
+            <w:pPr>
+              <w:jc w:val="center"/>
+              <w:rPr>
+                <w:sz w:val="18"/>
+                <w:szCs w:val="18"/>
+              </w:rPr>
+            </w:pPr>
+            <w:r>
+              <w:rPr>
+                <w:sz w:val="18"/>
+                <w:szCs w:val="18"/>
+              </w:rPr>
+              <w:t>{</w:t>
+            </w:r>
+            <w:proofErr w:type="spellStart"/>
+            <w:r>
+              <w:rPr>
+                <w:sz w:val="18"/>
+                <w:szCs w:val="18"/>
+              </w:rPr>
+              <w:t>sNegC</w:t>
+            </w:r>
+            <w:proofErr w:type="spellEnd"/>
             <w:r>
               <w:rPr>
                 <w:sz w:val="18"/>
@@ -1968,7 +1331,7 @@
         </w:tc>
         <w:tc>
           <w:tcPr>
-            <w:tcW w:w="1419" w:type="dxa"/>
+            <w:tcW w:w="960" w:type="dxa"/>
           </w:tcPr>
           <w:p>
             <w:pPr>
@@ -1983,13 +1346,29 @@
                 <w:sz w:val="18"/>
                 <w:szCs w:val="18"/>
               </w:rPr>
-              <w:t>{sNegP1}%</w:t>
-            </w:r>
-          </w:p>
-        </w:tc>
-        <w:tc>
-          <w:tcPr>
-            <w:tcW w:w="1483" w:type="dxa"/>
+              <w:t>{</w:t>
+            </w:r>
+            <w:proofErr w:type="spellStart"/>
+            <w:r>
+              <w:rPr>
+                <w:sz w:val="18"/>
+                <w:szCs w:val="18"/>
+              </w:rPr>
+              <w:t>sNeuP</w:t>
+            </w:r>
+            <w:proofErr w:type="spellEnd"/>
+            <w:r>
+              <w:rPr>
+                <w:sz w:val="18"/>
+                <w:szCs w:val="18"/>
+              </w:rPr>
+              <w:t>}%</w:t>
+            </w:r>
+          </w:p>
+        </w:tc>
+        <w:tc>
+          <w:tcPr>
+            <w:tcW w:w="836" w:type="dxa"/>
           </w:tcPr>
           <w:p>
             <w:pPr>
@@ -2004,13 +1383,29 @@
                 <w:sz w:val="18"/>
                 <w:szCs w:val="18"/>
               </w:rPr>
-              <w:t>{sNegC1}</w:t>
-            </w:r>
-          </w:p>
-        </w:tc>
-        <w:tc>
-          <w:tcPr>
-            <w:tcW w:w="1458" w:type="dxa"/>
+              <w:t>{</w:t>
+            </w:r>
+            <w:proofErr w:type="spellStart"/>
+            <w:r>
+              <w:rPr>
+                <w:sz w:val="18"/>
+                <w:szCs w:val="18"/>
+              </w:rPr>
+              <w:t>sNeuC</w:t>
+            </w:r>
+            <w:proofErr w:type="spellEnd"/>
+            <w:r>
+              <w:rPr>
+                <w:sz w:val="18"/>
+                <w:szCs w:val="18"/>
+              </w:rPr>
+              <w:t>}</w:t>
+            </w:r>
+          </w:p>
+        </w:tc>
+        <w:tc>
+          <w:tcPr>
+            <w:tcW w:w="922" w:type="dxa"/>
           </w:tcPr>
           <w:p>
             <w:pPr>
@@ -2025,13 +1420,29 @@
                 <w:sz w:val="18"/>
                 <w:szCs w:val="18"/>
               </w:rPr>
-              <w:t>{sNeuP1}%</w:t>
-            </w:r>
-          </w:p>
-        </w:tc>
-        <w:tc>
-          <w:tcPr>
-            <w:tcW w:w="1211" w:type="dxa"/>
+              <w:t>{</w:t>
+            </w:r>
+            <w:proofErr w:type="spellStart"/>
+            <w:r>
+              <w:rPr>
+                <w:sz w:val="18"/>
+                <w:szCs w:val="18"/>
+              </w:rPr>
+              <w:t>sPosP</w:t>
+            </w:r>
+            <w:proofErr w:type="spellEnd"/>
+            <w:r>
+              <w:rPr>
+                <w:sz w:val="18"/>
+                <w:szCs w:val="18"/>
+              </w:rPr>
+              <w:t>}%</w:t>
+            </w:r>
+          </w:p>
+        </w:tc>
+        <w:tc>
+          <w:tcPr>
+            <w:tcW w:w="2409" w:type="dxa"/>
           </w:tcPr>
           <w:p>
             <w:pPr>
@@ -2046,840 +1457,35 @@
                 <w:sz w:val="18"/>
                 <w:szCs w:val="18"/>
               </w:rPr>
-              <w:t>{sNeuC1}</w:t>
-            </w:r>
-          </w:p>
-        </w:tc>
-        <w:tc>
-          <w:tcPr>
-            <w:tcW w:w="1216" w:type="dxa"/>
-          </w:tcPr>
-          <w:p>
-            <w:pPr>
-              <w:jc w:val="center"/>
-              <w:rPr>
-                <w:sz w:val="18"/>
-                <w:szCs w:val="18"/>
-              </w:rPr>
-            </w:pPr>
-            <w:r>
-              <w:rPr>
-                <w:sz w:val="18"/>
-                <w:szCs w:val="18"/>
-              </w:rPr>
-              <w:t>{sPosP1}%</w:t>
-            </w:r>
-          </w:p>
-        </w:tc>
-        <w:tc>
-          <w:tcPr>
-            <w:tcW w:w="1008" w:type="dxa"/>
-          </w:tcPr>
-          <w:p>
-            <w:pPr>
-              <w:jc w:val="center"/>
-              <w:rPr>
-                <w:sz w:val="18"/>
-                <w:szCs w:val="18"/>
-              </w:rPr>
-            </w:pPr>
-            <w:r>
-              <w:rPr>
-                <w:sz w:val="18"/>
-                <w:szCs w:val="18"/>
-              </w:rPr>
-              <w:t>{sPosC1}</w:t>
-            </w:r>
-          </w:p>
-        </w:tc>
-      </w:tr>
-      <w:tr>
-        <w:tc>
-          <w:tcPr>
-            <w:tcW w:w="1555" w:type="dxa"/>
-          </w:tcPr>
-          <w:p>
-            <w:pPr>
-              <w:rPr>
-                <w:sz w:val="18"/>
-                <w:szCs w:val="18"/>
-              </w:rPr>
-            </w:pPr>
-            <w:r>
-              <w:rPr>
-                <w:sz w:val="18"/>
-                <w:szCs w:val="18"/>
-              </w:rPr>
               <w:t>{</w:t>
             </w:r>
-            <w:r>
-              <w:rPr>
-                <w:sz w:val="18"/>
-                <w:szCs w:val="18"/>
-              </w:rPr>
-              <w:t>service_name</w:t>
-            </w:r>
-            <w:r>
-              <w:rPr>
-                <w:sz w:val="18"/>
-                <w:szCs w:val="18"/>
-              </w:rPr>
-              <w:t>2}</w:t>
-            </w:r>
-          </w:p>
-        </w:tc>
-        <w:tc>
-          <w:tcPr>
-            <w:tcW w:w="1419" w:type="dxa"/>
-          </w:tcPr>
-          <w:p>
-            <w:pPr>
-              <w:jc w:val="center"/>
-              <w:rPr>
-                <w:sz w:val="18"/>
-                <w:szCs w:val="18"/>
-              </w:rPr>
-            </w:pPr>
-            <w:r>
-              <w:rPr>
-                <w:sz w:val="18"/>
-                <w:szCs w:val="18"/>
-              </w:rPr>
-              <w:t>{sNegP2}%</w:t>
-            </w:r>
-          </w:p>
-        </w:tc>
-        <w:tc>
-          <w:tcPr>
-            <w:tcW w:w="1483" w:type="dxa"/>
-          </w:tcPr>
-          <w:p>
-            <w:pPr>
-              <w:jc w:val="center"/>
-              <w:rPr>
-                <w:sz w:val="18"/>
-                <w:szCs w:val="18"/>
-              </w:rPr>
-            </w:pPr>
-            <w:r>
-              <w:rPr>
-                <w:sz w:val="18"/>
-                <w:szCs w:val="18"/>
-              </w:rPr>
-              <w:t>{sNegC2}</w:t>
-            </w:r>
-          </w:p>
-        </w:tc>
-        <w:tc>
-          <w:tcPr>
-            <w:tcW w:w="1458" w:type="dxa"/>
-          </w:tcPr>
-          <w:p>
-            <w:pPr>
-              <w:jc w:val="center"/>
-              <w:rPr>
-                <w:sz w:val="18"/>
-                <w:szCs w:val="18"/>
-              </w:rPr>
-            </w:pPr>
-            <w:r>
-              <w:rPr>
-                <w:sz w:val="18"/>
-                <w:szCs w:val="18"/>
-              </w:rPr>
-              <w:t>{sNeuP2}%</w:t>
-            </w:r>
-          </w:p>
-        </w:tc>
-        <w:tc>
-          <w:tcPr>
-            <w:tcW w:w="1211" w:type="dxa"/>
-          </w:tcPr>
-          <w:p>
-            <w:pPr>
-              <w:jc w:val="center"/>
-              <w:rPr>
-                <w:sz w:val="18"/>
-                <w:szCs w:val="18"/>
-              </w:rPr>
-            </w:pPr>
-            <w:r>
-              <w:rPr>
-                <w:sz w:val="18"/>
-                <w:szCs w:val="18"/>
-              </w:rPr>
-              <w:t>{sNeuC2}</w:t>
-            </w:r>
-          </w:p>
-        </w:tc>
-        <w:tc>
-          <w:tcPr>
-            <w:tcW w:w="1216" w:type="dxa"/>
-          </w:tcPr>
-          <w:p>
-            <w:pPr>
-              <w:jc w:val="center"/>
-              <w:rPr>
-                <w:sz w:val="18"/>
-                <w:szCs w:val="18"/>
-              </w:rPr>
-            </w:pPr>
-            <w:r>
-              <w:rPr>
-                <w:sz w:val="18"/>
-                <w:szCs w:val="18"/>
-              </w:rPr>
-              <w:t>{sPosP2}%</w:t>
-            </w:r>
-          </w:p>
-        </w:tc>
-        <w:tc>
-          <w:tcPr>
-            <w:tcW w:w="1008" w:type="dxa"/>
-          </w:tcPr>
-          <w:p>
-            <w:pPr>
-              <w:jc w:val="center"/>
-              <w:rPr>
-                <w:sz w:val="18"/>
-                <w:szCs w:val="18"/>
-              </w:rPr>
-            </w:pPr>
-            <w:r>
-              <w:rPr>
-                <w:sz w:val="18"/>
-                <w:szCs w:val="18"/>
-              </w:rPr>
-              <w:t>{sPosC2}</w:t>
-            </w:r>
-          </w:p>
-        </w:tc>
-      </w:tr>
-      <w:tr>
-        <w:tc>
-          <w:tcPr>
-            <w:tcW w:w="1555" w:type="dxa"/>
-          </w:tcPr>
-          <w:p>
-            <w:pPr>
-              <w:rPr>
-                <w:sz w:val="18"/>
-                <w:szCs w:val="18"/>
-              </w:rPr>
-            </w:pPr>
-            <w:r>
-              <w:rPr>
-                <w:sz w:val="18"/>
-                <w:szCs w:val="18"/>
-              </w:rPr>
-              <w:t>{</w:t>
-            </w:r>
-            <w:r>
-              <w:rPr>
-                <w:sz w:val="18"/>
-                <w:szCs w:val="18"/>
-              </w:rPr>
-              <w:t>service_name</w:t>
-            </w:r>
-            <w:r>
-              <w:rPr>
-                <w:sz w:val="18"/>
-                <w:szCs w:val="18"/>
-              </w:rPr>
-              <w:t>3}</w:t>
-            </w:r>
-          </w:p>
-        </w:tc>
-        <w:tc>
-          <w:tcPr>
-            <w:tcW w:w="1419" w:type="dxa"/>
-          </w:tcPr>
-          <w:p>
-            <w:pPr>
-              <w:jc w:val="center"/>
-              <w:rPr>
-                <w:sz w:val="18"/>
-                <w:szCs w:val="18"/>
-              </w:rPr>
-            </w:pPr>
-            <w:r>
-              <w:rPr>
-                <w:sz w:val="18"/>
-                <w:szCs w:val="18"/>
-              </w:rPr>
-              <w:t>{sNegP3}%</w:t>
-            </w:r>
-          </w:p>
-        </w:tc>
-        <w:tc>
-          <w:tcPr>
-            <w:tcW w:w="1483" w:type="dxa"/>
-          </w:tcPr>
-          <w:p>
-            <w:pPr>
-              <w:jc w:val="center"/>
-              <w:rPr>
-                <w:sz w:val="18"/>
-                <w:szCs w:val="18"/>
-              </w:rPr>
-            </w:pPr>
-            <w:r>
-              <w:rPr>
-                <w:sz w:val="18"/>
-                <w:szCs w:val="18"/>
-              </w:rPr>
-              <w:t>{sNegC3}</w:t>
-            </w:r>
-          </w:p>
-        </w:tc>
-        <w:tc>
-          <w:tcPr>
-            <w:tcW w:w="1458" w:type="dxa"/>
-          </w:tcPr>
-          <w:p>
-            <w:pPr>
-              <w:jc w:val="center"/>
-              <w:rPr>
-                <w:sz w:val="18"/>
-                <w:szCs w:val="18"/>
-              </w:rPr>
-            </w:pPr>
-            <w:r>
-              <w:rPr>
-                <w:sz w:val="18"/>
-                <w:szCs w:val="18"/>
-              </w:rPr>
-              <w:t>{sNeuP3}%</w:t>
-            </w:r>
-          </w:p>
-        </w:tc>
-        <w:tc>
-          <w:tcPr>
-            <w:tcW w:w="1211" w:type="dxa"/>
-          </w:tcPr>
-          <w:p>
-            <w:pPr>
-              <w:jc w:val="center"/>
-              <w:rPr>
-                <w:sz w:val="18"/>
-                <w:szCs w:val="18"/>
-              </w:rPr>
-            </w:pPr>
-            <w:r>
-              <w:rPr>
-                <w:sz w:val="18"/>
-                <w:szCs w:val="18"/>
-              </w:rPr>
-              <w:t>{sNeuC3}</w:t>
-            </w:r>
-          </w:p>
-        </w:tc>
-        <w:tc>
-          <w:tcPr>
-            <w:tcW w:w="1216" w:type="dxa"/>
-          </w:tcPr>
-          <w:p>
-            <w:pPr>
-              <w:jc w:val="center"/>
-              <w:rPr>
-                <w:sz w:val="18"/>
-                <w:szCs w:val="18"/>
-              </w:rPr>
-            </w:pPr>
-            <w:r>
-              <w:rPr>
-                <w:sz w:val="18"/>
-                <w:szCs w:val="18"/>
-              </w:rPr>
-              <w:t>{sPosP3}%</w:t>
-            </w:r>
-          </w:p>
-        </w:tc>
-        <w:tc>
-          <w:tcPr>
-            <w:tcW w:w="1008" w:type="dxa"/>
-          </w:tcPr>
-          <w:p>
-            <w:pPr>
-              <w:jc w:val="center"/>
-              <w:rPr>
-                <w:sz w:val="18"/>
-                <w:szCs w:val="18"/>
-              </w:rPr>
-            </w:pPr>
-            <w:r>
-              <w:rPr>
-                <w:sz w:val="18"/>
-                <w:szCs w:val="18"/>
-              </w:rPr>
-              <w:t>{sPosC3}</w:t>
-            </w:r>
-          </w:p>
-        </w:tc>
-      </w:tr>
-      <w:tr>
-        <w:tc>
-          <w:tcPr>
-            <w:tcW w:w="1555" w:type="dxa"/>
-          </w:tcPr>
-          <w:p>
-            <w:pPr>
-              <w:rPr>
-                <w:sz w:val="18"/>
-                <w:szCs w:val="18"/>
-              </w:rPr>
-            </w:pPr>
-            <w:r>
-              <w:rPr>
-                <w:sz w:val="18"/>
-                <w:szCs w:val="18"/>
-              </w:rPr>
-              <w:t>{</w:t>
-            </w:r>
-            <w:r>
-              <w:rPr>
-                <w:sz w:val="18"/>
-                <w:szCs w:val="18"/>
-              </w:rPr>
-              <w:t>service_name</w:t>
-            </w:r>
-            <w:r>
-              <w:rPr>
-                <w:sz w:val="18"/>
-                <w:szCs w:val="18"/>
-              </w:rPr>
-              <w:t>4}</w:t>
-            </w:r>
-          </w:p>
-        </w:tc>
-        <w:tc>
-          <w:tcPr>
-            <w:tcW w:w="1419" w:type="dxa"/>
-          </w:tcPr>
-          <w:p>
-            <w:pPr>
-              <w:jc w:val="center"/>
-              <w:rPr>
-                <w:sz w:val="18"/>
-                <w:szCs w:val="18"/>
-              </w:rPr>
-            </w:pPr>
-            <w:r>
-              <w:rPr>
-                <w:sz w:val="18"/>
-                <w:szCs w:val="18"/>
-              </w:rPr>
-              <w:t>{sNegP4}%</w:t>
-            </w:r>
-          </w:p>
-        </w:tc>
-        <w:tc>
-          <w:tcPr>
-            <w:tcW w:w="1483" w:type="dxa"/>
-          </w:tcPr>
-          <w:p>
-            <w:pPr>
-              <w:jc w:val="center"/>
-              <w:rPr>
-                <w:sz w:val="18"/>
-                <w:szCs w:val="18"/>
-              </w:rPr>
-            </w:pPr>
-            <w:r>
-              <w:rPr>
-                <w:sz w:val="18"/>
-                <w:szCs w:val="18"/>
-              </w:rPr>
-              <w:t>{sNegC4}</w:t>
-            </w:r>
-          </w:p>
-        </w:tc>
-        <w:tc>
-          <w:tcPr>
-            <w:tcW w:w="1458" w:type="dxa"/>
-          </w:tcPr>
-          <w:p>
-            <w:pPr>
-              <w:jc w:val="center"/>
-              <w:rPr>
-                <w:sz w:val="18"/>
-                <w:szCs w:val="18"/>
-              </w:rPr>
-            </w:pPr>
-            <w:r>
-              <w:rPr>
-                <w:sz w:val="18"/>
-                <w:szCs w:val="18"/>
-              </w:rPr>
-              <w:t>{sNeuP4}%</w:t>
-            </w:r>
-          </w:p>
-        </w:tc>
-        <w:tc>
-          <w:tcPr>
-            <w:tcW w:w="1211" w:type="dxa"/>
-          </w:tcPr>
-          <w:p>
-            <w:pPr>
-              <w:jc w:val="center"/>
-              <w:rPr>
-                <w:sz w:val="18"/>
-                <w:szCs w:val="18"/>
-              </w:rPr>
-            </w:pPr>
-            <w:r>
-              <w:rPr>
-                <w:sz w:val="18"/>
-                <w:szCs w:val="18"/>
-              </w:rPr>
-              <w:t>{sNeuC4}</w:t>
-            </w:r>
-          </w:p>
-        </w:tc>
-        <w:tc>
-          <w:tcPr>
-            <w:tcW w:w="1216" w:type="dxa"/>
-          </w:tcPr>
-          <w:p>
-            <w:pPr>
-              <w:jc w:val="center"/>
-              <w:rPr>
-                <w:sz w:val="18"/>
-                <w:szCs w:val="18"/>
-              </w:rPr>
-            </w:pPr>
-            <w:r>
-              <w:rPr>
-                <w:sz w:val="18"/>
-                <w:szCs w:val="18"/>
-              </w:rPr>
-              <w:t>{sPosP4}%</w:t>
-            </w:r>
-          </w:p>
-        </w:tc>
-        <w:tc>
-          <w:tcPr>
-            <w:tcW w:w="1008" w:type="dxa"/>
-          </w:tcPr>
-          <w:p>
-            <w:pPr>
-              <w:jc w:val="center"/>
-              <w:rPr>
-                <w:sz w:val="18"/>
-                <w:szCs w:val="18"/>
-              </w:rPr>
-            </w:pPr>
-            <w:r>
-              <w:rPr>
-                <w:sz w:val="18"/>
-                <w:szCs w:val="18"/>
-              </w:rPr>
-              <w:t>{sPosC4}</w:t>
-            </w:r>
-          </w:p>
-        </w:tc>
-      </w:tr>
-      <w:tr>
-        <w:tc>
-          <w:tcPr>
-            <w:tcW w:w="1555" w:type="dxa"/>
-          </w:tcPr>
-          <w:p>
-            <w:pPr>
-              <w:rPr>
-                <w:rFonts w:ascii="Aptos" w:hAnsi="Aptos"/>
-                <w:sz w:val="18"/>
-                <w:szCs w:val="18"/>
-              </w:rPr>
-            </w:pPr>
-            <w:r>
-              <w:rPr>
-                <w:rFonts w:ascii="Aptos" w:hAnsi="Aptos"/>
-                <w:color w:val="000000"/>
-                <w:sz w:val="18"/>
-                <w:szCs w:val="18"/>
-              </w:rPr>
-              <w:t>{#additional_services}{name}</w:t>
-            </w:r>
-          </w:p>
-        </w:tc>
-        <w:tc>
-          <w:tcPr>
-            <w:tcW w:w="1419" w:type="dxa"/>
-          </w:tcPr>
-          <w:p>
-            <w:pPr>
-              <w:jc w:val="center"/>
-              <w:rPr>
-                <w:rFonts w:ascii="Aptos" w:hAnsi="Aptos"/>
-                <w:sz w:val="18"/>
-                <w:szCs w:val="18"/>
-              </w:rPr>
-            </w:pPr>
-            <w:r>
-              <w:rPr>
-                <w:rFonts w:ascii="Aptos" w:hAnsi="Aptos"/>
-                <w:color w:val="000000"/>
-                <w:sz w:val="18"/>
-                <w:szCs w:val="18"/>
-              </w:rPr>
-              <w:t>{</w:t>
-            </w:r>
             <w:proofErr w:type="spellStart"/>
             <w:r>
               <w:rPr>
-                <w:rFonts w:ascii="Aptos" w:hAnsi="Aptos"/>
-                <w:color w:val="000000"/>
-                <w:sz w:val="18"/>
-                <w:szCs w:val="18"/>
-              </w:rPr>
-              <w:t>sNegP</w:t>
+                <w:sz w:val="18"/>
+                <w:szCs w:val="18"/>
+              </w:rPr>
+              <w:t>sPosC</w:t>
             </w:r>
             <w:proofErr w:type="spellEnd"/>
             <w:r>
               <w:rPr>
-                <w:rFonts w:ascii="Aptos" w:hAnsi="Aptos"/>
-                <w:color w:val="000000"/>
-                <w:sz w:val="18"/>
-                <w:szCs w:val="18"/>
-              </w:rPr>
-              <w:t>}%</w:t>
-            </w:r>
-          </w:p>
-        </w:tc>
-        <w:tc>
-          <w:tcPr>
-            <w:tcW w:w="1483" w:type="dxa"/>
-          </w:tcPr>
-          <w:p>
-            <w:pPr>
-              <w:jc w:val="center"/>
-              <w:rPr>
-                <w:rFonts w:ascii="Aptos" w:hAnsi="Aptos"/>
-                <w:sz w:val="18"/>
-                <w:szCs w:val="18"/>
-              </w:rPr>
-            </w:pPr>
-            <w:r>
-              <w:rPr>
-                <w:rFonts w:ascii="Aptos" w:hAnsi="Aptos"/>
-                <w:color w:val="000000"/>
-                <w:sz w:val="18"/>
-                <w:szCs w:val="18"/>
-              </w:rPr>
-              <w:t>{</w:t>
+                <w:sz w:val="18"/>
+                <w:szCs w:val="18"/>
+              </w:rPr>
+              <w:t>}{/</w:t>
             </w:r>
             <w:proofErr w:type="spellStart"/>
             <w:r>
               <w:rPr>
-                <w:rFonts w:ascii="Aptos" w:hAnsi="Aptos"/>
-                <w:color w:val="000000"/>
-                <w:sz w:val="18"/>
-                <w:szCs w:val="18"/>
-              </w:rPr>
-              <w:t>sNegC</w:t>
+                <w:sz w:val="18"/>
+                <w:szCs w:val="18"/>
+              </w:rPr>
+              <w:t>serviceRows</w:t>
             </w:r>
             <w:proofErr w:type="spellEnd"/>
             <w:r>
               <w:rPr>
-                <w:rFonts w:ascii="Aptos" w:hAnsi="Aptos"/>
-                <w:color w:val="000000"/>
-                <w:sz w:val="18"/>
-                <w:szCs w:val="18"/>
-              </w:rPr>
-              <w:t>}</w:t>
-            </w:r>
-          </w:p>
-        </w:tc>
-        <w:tc>
-          <w:tcPr>
-            <w:tcW w:w="1458" w:type="dxa"/>
-          </w:tcPr>
-          <w:p>
-            <w:pPr>
-              <w:jc w:val="center"/>
-              <w:rPr>
-                <w:rFonts w:ascii="Aptos" w:hAnsi="Aptos"/>
-                <w:sz w:val="18"/>
-                <w:szCs w:val="18"/>
-              </w:rPr>
-            </w:pPr>
-            <w:r>
-              <w:rPr>
-                <w:rFonts w:ascii="Aptos" w:hAnsi="Aptos"/>
-                <w:color w:val="000000"/>
-                <w:sz w:val="18"/>
-                <w:szCs w:val="18"/>
-              </w:rPr>
-              <w:t>{</w:t>
-            </w:r>
-            <w:proofErr w:type="spellStart"/>
-            <w:r>
-              <w:rPr>
-                <w:rFonts w:ascii="Aptos" w:hAnsi="Aptos"/>
-                <w:color w:val="000000"/>
-                <w:sz w:val="18"/>
-                <w:szCs w:val="18"/>
-              </w:rPr>
-              <w:t>sNeuP</w:t>
-            </w:r>
-            <w:proofErr w:type="spellEnd"/>
-            <w:r>
-              <w:rPr>
-                <w:rFonts w:ascii="Aptos" w:hAnsi="Aptos"/>
-                <w:color w:val="000000"/>
-                <w:sz w:val="18"/>
-                <w:szCs w:val="18"/>
-              </w:rPr>
-              <w:t>}%</w:t>
-            </w:r>
-          </w:p>
-        </w:tc>
-        <w:tc>
-          <w:tcPr>
-            <w:tcW w:w="1211" w:type="dxa"/>
-          </w:tcPr>
-          <w:p>
-            <w:pPr>
-              <w:jc w:val="center"/>
-              <w:rPr>
-                <w:rFonts w:ascii="Aptos" w:hAnsi="Aptos"/>
-                <w:sz w:val="18"/>
-                <w:szCs w:val="18"/>
-              </w:rPr>
-            </w:pPr>
-            <w:r>
-              <w:rPr>
-                <w:rFonts w:ascii="Aptos" w:hAnsi="Aptos"/>
-                <w:color w:val="000000"/>
-                <w:sz w:val="18"/>
-                <w:szCs w:val="18"/>
-              </w:rPr>
-              <w:t>{</w:t>
-            </w:r>
-            <w:proofErr w:type="spellStart"/>
-            <w:r>
-              <w:rPr>
-                <w:rFonts w:ascii="Aptos" w:hAnsi="Aptos"/>
-                <w:color w:val="000000"/>
-                <w:sz w:val="18"/>
-                <w:szCs w:val="18"/>
-              </w:rPr>
-              <w:t>sNeuC</w:t>
-            </w:r>
-            <w:proofErr w:type="spellEnd"/>
-            <w:r>
-              <w:rPr>
-                <w:rFonts w:ascii="Aptos" w:hAnsi="Aptos"/>
-                <w:color w:val="000000"/>
-                <w:sz w:val="18"/>
-                <w:szCs w:val="18"/>
-              </w:rPr>
-              <w:t>}</w:t>
-            </w:r>
-          </w:p>
-        </w:tc>
-        <w:tc>
-          <w:tcPr>
-            <w:tcW w:w="1216" w:type="dxa"/>
-          </w:tcPr>
-          <w:p>
-            <w:pPr>
-              <w:jc w:val="center"/>
-              <w:rPr>
-                <w:rFonts w:ascii="Aptos" w:hAnsi="Aptos"/>
-                <w:sz w:val="18"/>
-                <w:szCs w:val="18"/>
-              </w:rPr>
-            </w:pPr>
-            <w:r>
-              <w:rPr>
-                <w:rFonts w:ascii="Aptos" w:hAnsi="Aptos"/>
-                <w:color w:val="000000"/>
-                <w:sz w:val="18"/>
-                <w:szCs w:val="18"/>
-              </w:rPr>
-              <w:t>{</w:t>
-            </w:r>
-            <w:proofErr w:type="spellStart"/>
-            <w:r>
-              <w:rPr>
-                <w:rFonts w:ascii="Aptos" w:hAnsi="Aptos"/>
-                <w:color w:val="000000"/>
-                <w:sz w:val="18"/>
-                <w:szCs w:val="18"/>
-              </w:rPr>
-              <w:t>sPosP</w:t>
-            </w:r>
-            <w:proofErr w:type="spellEnd"/>
-            <w:r>
-              <w:rPr>
-                <w:rFonts w:ascii="Aptos" w:hAnsi="Aptos"/>
-                <w:color w:val="000000"/>
-                <w:sz w:val="18"/>
-                <w:szCs w:val="18"/>
-              </w:rPr>
-              <w:t>}%</w:t>
-            </w:r>
-          </w:p>
-        </w:tc>
-        <w:tc>
-          <w:tcPr>
-            <w:tcW w:w="1008" w:type="dxa"/>
-          </w:tcPr>
-          <w:p>
-            <w:pPr>
-              <w:jc w:val="center"/>
-              <w:rPr>
-                <w:rFonts w:ascii="Aptos" w:hAnsi="Aptos"/>
-                <w:sz w:val="18"/>
-                <w:szCs w:val="18"/>
-              </w:rPr>
-            </w:pPr>
-            <w:r>
-              <w:rPr>
-                <w:rFonts w:ascii="Aptos" w:hAnsi="Aptos"/>
-                <w:color w:val="000000"/>
-                <w:sz w:val="18"/>
-                <w:szCs w:val="18"/>
-              </w:rPr>
-              <w:t>{</w:t>
-            </w:r>
-            <w:proofErr w:type="spellStart"/>
-            <w:r>
-              <w:rPr>
-                <w:rFonts w:ascii="Aptos" w:hAnsi="Aptos"/>
-                <w:color w:val="000000"/>
-                <w:sz w:val="18"/>
-                <w:szCs w:val="18"/>
-              </w:rPr>
-              <w:t>sPosC</w:t>
-            </w:r>
-            <w:proofErr w:type="spellEnd"/>
-            <w:r>
-              <w:rPr>
-                <w:rFonts w:ascii="Aptos" w:hAnsi="Aptos"/>
-                <w:color w:val="000000"/>
-                <w:sz w:val="18"/>
-                <w:szCs w:val="18"/>
-              </w:rPr>
-              <w:t>}{/</w:t>
-            </w:r>
-            <w:proofErr w:type="spellStart"/>
-            <w:r>
-              <w:rPr>
-                <w:rFonts w:ascii="Aptos" w:hAnsi="Aptos"/>
-                <w:color w:val="000000"/>
-                <w:sz w:val="18"/>
-                <w:szCs w:val="18"/>
-              </w:rPr>
-              <w:t>additional_services</w:t>
-            </w:r>
-            <w:proofErr w:type="spellEnd"/>
-            <w:r>
-              <w:rPr>
-                <w:rFonts w:ascii="Aptos" w:hAnsi="Aptos"/>
-                <w:color w:val="000000"/>
                 <w:sz w:val="18"/>
                 <w:szCs w:val="18"/>
               </w:rPr>
@@ -2928,28 +1534,28 @@
         <w:tblLook w:val="04A0" w:firstRow="1" w:lastRow="0" w:firstColumn="1" w:lastColumn="0" w:noHBand="0" w:noVBand="1"/>
       </w:tblPr>
       <w:tblGrid>
-        <w:gridCol w:w="2014"/>
-        <w:gridCol w:w="2053"/>
-        <w:gridCol w:w="2018"/>
-        <w:gridCol w:w="3265"/>
+        <w:gridCol w:w="1729"/>
+        <w:gridCol w:w="1713"/>
+        <w:gridCol w:w="1646"/>
+        <w:gridCol w:w="4262"/>
       </w:tblGrid>
       <w:tr>
         <w:tc>
           <w:tcPr>
-            <w:tcW w:w="1532" w:type="dxa"/>
-          </w:tcPr>
-          <w:p>
-            <w:pPr>
-              <w:rPr>
-                <w:sz w:val="18"/>
-                <w:szCs w:val="18"/>
-              </w:rPr>
-            </w:pPr>
-          </w:p>
-        </w:tc>
-        <w:tc>
-          <w:tcPr>
-            <w:tcW w:w="2856" w:type="dxa"/>
+            <w:tcW w:w="1743" w:type="dxa"/>
+          </w:tcPr>
+          <w:p>
+            <w:pPr>
+              <w:rPr>
+                <w:sz w:val="18"/>
+                <w:szCs w:val="18"/>
+              </w:rPr>
+            </w:pPr>
+          </w:p>
+        </w:tc>
+        <w:tc>
+          <w:tcPr>
+            <w:tcW w:w="1710" w:type="dxa"/>
           </w:tcPr>
           <w:p>
             <w:pPr>
@@ -2974,7 +1580,7 @@
         </w:tc>
         <w:tc>
           <w:tcPr>
-            <w:tcW w:w="2481" w:type="dxa"/>
+            <w:tcW w:w="1643" w:type="dxa"/>
           </w:tcPr>
           <w:p>
             <w:pPr>
@@ -2999,7 +1605,7 @@
         </w:tc>
         <w:tc>
           <w:tcPr>
-            <w:tcW w:w="2481" w:type="dxa"/>
+            <w:tcW w:w="4254" w:type="dxa"/>
           </w:tcPr>
           <w:p>
             <w:pPr>
@@ -3026,57 +1632,30 @@
       <w:tr>
         <w:tc>
           <w:tcPr>
-            <w:tcW w:w="1532" w:type="dxa"/>
+            <w:tcW w:w="1743" w:type="dxa"/>
           </w:tcPr>
           <w:p>
             <w:pPr>
               <w:rPr>
                 <w:b/>
                 <w:bCs/>
-              </w:rPr>
-            </w:pPr>
-            <w:r>
-              <w:rPr>
-                <w:sz w:val="18"/>
-                <w:szCs w:val="18"/>
-              </w:rPr>
-              <w:t>{</w:t>
-            </w:r>
-            <w:r>
-              <w:rPr>
-                <w:sz w:val="18"/>
-                <w:szCs w:val="18"/>
-              </w:rPr>
-              <w:t>service_name1</w:t>
-            </w:r>
-            <w:r>
-              <w:rPr>
-                <w:sz w:val="18"/>
-                <w:szCs w:val="18"/>
-              </w:rPr>
-              <w:t>}</w:t>
-            </w:r>
-          </w:p>
-        </w:tc>
-        <w:tc>
-          <w:tcPr>
-            <w:tcW w:w="2856" w:type="dxa"/>
-          </w:tcPr>
-          <w:p>
-            <w:pPr>
-              <w:rPr>
-                <w:sz w:val="18"/>
-                <w:szCs w:val="18"/>
-              </w:rPr>
-            </w:pPr>
-            <w:r>
-              <w:rPr>
-                <w:sz w:val="18"/>
-                <w:szCs w:val="18"/>
-              </w:rPr>
-              <w:t>{service_summary_negative1}</w:t>
-            </w:r>
-          </w:p>
+                <w:sz w:val="18"/>
+                <w:szCs w:val="18"/>
+              </w:rPr>
+            </w:pPr>
+            <w:r>
+              <w:rPr>
+                <w:sz w:val="18"/>
+                <w:szCs w:val="18"/>
+              </w:rPr>
+              <w:t>{#serviceTooltipRows}{name}</w:t>
+            </w:r>
+          </w:p>
+        </w:tc>
+        <w:tc>
+          <w:tcPr>
+            <w:tcW w:w="1710" w:type="dxa"/>
+          </w:tcPr>
           <w:p>
             <w:pPr>
               <w:rPr>
@@ -3086,27 +1665,35 @@
                 <w:szCs w:val="18"/>
               </w:rPr>
             </w:pPr>
-          </w:p>
-        </w:tc>
-        <w:tc>
-          <w:tcPr>
-            <w:tcW w:w="2481" w:type="dxa"/>
-          </w:tcPr>
-          <w:p>
-            <w:pPr>
-              <w:rPr>
-                <w:sz w:val="18"/>
-                <w:szCs w:val="18"/>
-              </w:rPr>
-            </w:pPr>
-            <w:r>
-              <w:rPr>
-                <w:sz w:val="18"/>
-                <w:szCs w:val="18"/>
-              </w:rPr>
-              <w:t>{service_summary_neutral1}</w:t>
-            </w:r>
-          </w:p>
+            <w:r>
+              <w:rPr>
+                <w:sz w:val="18"/>
+                <w:szCs w:val="18"/>
+              </w:rPr>
+              <w:t>{</w:t>
+            </w:r>
+            <w:proofErr w:type="spellStart"/>
+            <w:r>
+              <w:rPr>
+                <w:sz w:val="18"/>
+                <w:szCs w:val="18"/>
+              </w:rPr>
+              <w:t>service_summary_negative</w:t>
+            </w:r>
+            <w:proofErr w:type="spellEnd"/>
+            <w:r>
+              <w:rPr>
+                <w:sz w:val="18"/>
+                <w:szCs w:val="18"/>
+              </w:rPr>
+              <w:t>}</w:t>
+            </w:r>
+          </w:p>
+        </w:tc>
+        <w:tc>
+          <w:tcPr>
+            <w:tcW w:w="1643" w:type="dxa"/>
+          </w:tcPr>
           <w:p>
             <w:pPr>
               <w:rPr>
@@ -3116,27 +1703,35 @@
                 <w:szCs w:val="18"/>
               </w:rPr>
             </w:pPr>
-          </w:p>
-        </w:tc>
-        <w:tc>
-          <w:tcPr>
-            <w:tcW w:w="2481" w:type="dxa"/>
-          </w:tcPr>
-          <w:p>
-            <w:pPr>
-              <w:rPr>
-                <w:sz w:val="18"/>
-                <w:szCs w:val="18"/>
-              </w:rPr>
-            </w:pPr>
-            <w:r>
-              <w:rPr>
-                <w:sz w:val="18"/>
-                <w:szCs w:val="18"/>
-              </w:rPr>
-              <w:t>{service_summary_positive1}</w:t>
-            </w:r>
-          </w:p>
+            <w:r>
+              <w:rPr>
+                <w:sz w:val="18"/>
+                <w:szCs w:val="18"/>
+              </w:rPr>
+              <w:t>{</w:t>
+            </w:r>
+            <w:proofErr w:type="spellStart"/>
+            <w:r>
+              <w:rPr>
+                <w:sz w:val="18"/>
+                <w:szCs w:val="18"/>
+              </w:rPr>
+              <w:t>service_summary_neutral</w:t>
+            </w:r>
+            <w:proofErr w:type="spellEnd"/>
+            <w:r>
+              <w:rPr>
+                <w:sz w:val="18"/>
+                <w:szCs w:val="18"/>
+              </w:rPr>
+              <w:t>}</w:t>
+            </w:r>
+          </w:p>
+        </w:tc>
+        <w:tc>
+          <w:tcPr>
+            <w:tcW w:w="4254" w:type="dxa"/>
+          </w:tcPr>
           <w:p>
             <w:pPr>
               <w:rPr>
@@ -3146,541 +1741,26 @@
                 <w:szCs w:val="18"/>
               </w:rPr>
             </w:pPr>
-          </w:p>
-        </w:tc>
-      </w:tr>
-      <w:tr>
-        <w:tc>
-          <w:tcPr>
-            <w:tcW w:w="1532" w:type="dxa"/>
-          </w:tcPr>
-          <w:p>
-            <w:pPr>
-              <w:rPr>
-                <w:b/>
-                <w:bCs/>
-              </w:rPr>
-            </w:pPr>
-            <w:r>
-              <w:rPr>
-                <w:sz w:val="18"/>
-                <w:szCs w:val="18"/>
-              </w:rPr>
-              <w:t>{</w:t>
-            </w:r>
-            <w:r>
-              <w:rPr>
-                <w:sz w:val="18"/>
-                <w:szCs w:val="18"/>
-              </w:rPr>
-              <w:t>service_name</w:t>
-            </w:r>
-            <w:r>
-              <w:rPr>
-                <w:sz w:val="18"/>
-                <w:szCs w:val="18"/>
-              </w:rPr>
-              <w:t>2}</w:t>
-            </w:r>
-          </w:p>
-        </w:tc>
-        <w:tc>
-          <w:tcPr>
-            <w:tcW w:w="2856" w:type="dxa"/>
-          </w:tcPr>
-          <w:p>
-            <w:pPr>
-              <w:rPr>
-                <w:sz w:val="18"/>
-                <w:szCs w:val="18"/>
-              </w:rPr>
-            </w:pPr>
-            <w:r>
-              <w:rPr>
-                <w:sz w:val="18"/>
-                <w:szCs w:val="18"/>
-              </w:rPr>
-              <w:t>{service_summary_negative2}</w:t>
-            </w:r>
-          </w:p>
-          <w:p>
-            <w:pPr>
-              <w:rPr>
-                <w:b/>
-                <w:bCs/>
-                <w:sz w:val="18"/>
-                <w:szCs w:val="18"/>
-              </w:rPr>
-            </w:pPr>
-          </w:p>
-        </w:tc>
-        <w:tc>
-          <w:tcPr>
-            <w:tcW w:w="2481" w:type="dxa"/>
-          </w:tcPr>
-          <w:p>
-            <w:pPr>
-              <w:rPr>
-                <w:sz w:val="18"/>
-                <w:szCs w:val="18"/>
-              </w:rPr>
-            </w:pPr>
-            <w:r>
-              <w:rPr>
-                <w:sz w:val="18"/>
-                <w:szCs w:val="18"/>
-              </w:rPr>
-              <w:t>{service_summary_neutral2}</w:t>
-            </w:r>
-          </w:p>
-          <w:p>
-            <w:pPr>
-              <w:rPr>
-                <w:b/>
-                <w:bCs/>
-                <w:sz w:val="18"/>
-                <w:szCs w:val="18"/>
-              </w:rPr>
-            </w:pPr>
-          </w:p>
-        </w:tc>
-        <w:tc>
-          <w:tcPr>
-            <w:tcW w:w="2481" w:type="dxa"/>
-          </w:tcPr>
-          <w:p>
-            <w:pPr>
-              <w:rPr>
-                <w:sz w:val="18"/>
-                <w:szCs w:val="18"/>
-              </w:rPr>
-            </w:pPr>
-            <w:r>
-              <w:rPr>
-                <w:sz w:val="18"/>
-                <w:szCs w:val="18"/>
-              </w:rPr>
-              <w:t>{service_summary_positive2}</w:t>
-            </w:r>
-          </w:p>
-          <w:p>
-            <w:pPr>
-              <w:rPr>
-                <w:b/>
-                <w:bCs/>
-                <w:sz w:val="18"/>
-                <w:szCs w:val="18"/>
-              </w:rPr>
-            </w:pPr>
-          </w:p>
-        </w:tc>
-      </w:tr>
-      <w:tr>
-        <w:tc>
-          <w:tcPr>
-            <w:tcW w:w="1532" w:type="dxa"/>
-          </w:tcPr>
-          <w:p>
-            <w:pPr>
-              <w:rPr>
-                <w:b/>
-                <w:bCs/>
-              </w:rPr>
-            </w:pPr>
-            <w:r>
-              <w:rPr>
-                <w:sz w:val="18"/>
-                <w:szCs w:val="18"/>
-              </w:rPr>
-              <w:t>{</w:t>
-            </w:r>
-            <w:r>
-              <w:rPr>
-                <w:sz w:val="18"/>
-                <w:szCs w:val="18"/>
-              </w:rPr>
-              <w:t>service_name</w:t>
-            </w:r>
-            <w:r>
-              <w:rPr>
-                <w:sz w:val="18"/>
-                <w:szCs w:val="18"/>
-              </w:rPr>
-              <w:t>3}</w:t>
-            </w:r>
-          </w:p>
-        </w:tc>
-        <w:tc>
-          <w:tcPr>
-            <w:tcW w:w="2856" w:type="dxa"/>
-          </w:tcPr>
-          <w:p>
-            <w:pPr>
-              <w:rPr>
-                <w:sz w:val="18"/>
-                <w:szCs w:val="18"/>
-              </w:rPr>
-            </w:pPr>
-            <w:r>
-              <w:rPr>
-                <w:sz w:val="18"/>
-                <w:szCs w:val="18"/>
-              </w:rPr>
-              <w:t>{service_summary_negative3}</w:t>
-            </w:r>
-          </w:p>
-          <w:p>
-            <w:pPr>
-              <w:rPr>
-                <w:b/>
-                <w:bCs/>
-                <w:sz w:val="18"/>
-                <w:szCs w:val="18"/>
-              </w:rPr>
-            </w:pPr>
-          </w:p>
-        </w:tc>
-        <w:tc>
-          <w:tcPr>
-            <w:tcW w:w="2481" w:type="dxa"/>
-          </w:tcPr>
-          <w:p>
-            <w:pPr>
-              <w:rPr>
-                <w:sz w:val="18"/>
-                <w:szCs w:val="18"/>
-              </w:rPr>
-            </w:pPr>
-            <w:r>
-              <w:rPr>
-                <w:sz w:val="18"/>
-                <w:szCs w:val="18"/>
-              </w:rPr>
-              <w:t>{service_summary_neutral3}</w:t>
-            </w:r>
-          </w:p>
-          <w:p>
-            <w:pPr>
-              <w:rPr>
-                <w:b/>
-                <w:bCs/>
-                <w:sz w:val="18"/>
-                <w:szCs w:val="18"/>
-              </w:rPr>
-            </w:pPr>
-          </w:p>
-        </w:tc>
-        <w:tc>
-          <w:tcPr>
-            <w:tcW w:w="2481" w:type="dxa"/>
-          </w:tcPr>
-          <w:p>
-            <w:pPr>
-              <w:rPr>
-                <w:sz w:val="18"/>
-                <w:szCs w:val="18"/>
-              </w:rPr>
-            </w:pPr>
-            <w:r>
-              <w:rPr>
-                <w:sz w:val="18"/>
-                <w:szCs w:val="18"/>
-              </w:rPr>
-              <w:t>{service_summary_positive3}</w:t>
-            </w:r>
-          </w:p>
-          <w:p>
-            <w:pPr>
-              <w:rPr>
-                <w:b/>
-                <w:bCs/>
-                <w:sz w:val="18"/>
-                <w:szCs w:val="18"/>
-              </w:rPr>
-            </w:pPr>
-          </w:p>
-        </w:tc>
-      </w:tr>
-      <w:tr>
-        <w:tc>
-          <w:tcPr>
-            <w:tcW w:w="1532" w:type="dxa"/>
-          </w:tcPr>
-          <w:p>
-            <w:pPr>
-              <w:rPr>
-                <w:b/>
-                <w:bCs/>
-              </w:rPr>
-            </w:pPr>
-            <w:r>
-              <w:rPr>
-                <w:sz w:val="18"/>
-                <w:szCs w:val="18"/>
-              </w:rPr>
-              <w:t>{</w:t>
-            </w:r>
-            <w:r>
-              <w:rPr>
-                <w:sz w:val="18"/>
-                <w:szCs w:val="18"/>
-              </w:rPr>
-              <w:t>service_name</w:t>
-            </w:r>
-            <w:r>
-              <w:rPr>
-                <w:sz w:val="18"/>
-                <w:szCs w:val="18"/>
-              </w:rPr>
-              <w:t>4}</w:t>
-            </w:r>
-          </w:p>
-        </w:tc>
-        <w:tc>
-          <w:tcPr>
-            <w:tcW w:w="2856" w:type="dxa"/>
-          </w:tcPr>
-          <w:p>
-            <w:pPr>
-              <w:rPr>
-                <w:sz w:val="18"/>
-                <w:szCs w:val="18"/>
-              </w:rPr>
-            </w:pPr>
-            <w:r>
-              <w:rPr>
-                <w:sz w:val="18"/>
-                <w:szCs w:val="18"/>
-              </w:rPr>
-              <w:t>{service_summary_positive4}</w:t>
-            </w:r>
-          </w:p>
-          <w:p>
-            <w:pPr>
-              <w:rPr>
-                <w:b/>
-                <w:bCs/>
-                <w:sz w:val="18"/>
-                <w:szCs w:val="18"/>
-              </w:rPr>
-            </w:pPr>
-          </w:p>
-        </w:tc>
-        <w:tc>
-          <w:tcPr>
-            <w:tcW w:w="2481" w:type="dxa"/>
-          </w:tcPr>
-          <w:p>
-            <w:pPr>
-              <w:rPr>
-                <w:sz w:val="18"/>
-                <w:szCs w:val="18"/>
-              </w:rPr>
-            </w:pPr>
-            <w:r>
-              <w:rPr>
-                <w:sz w:val="18"/>
-                <w:szCs w:val="18"/>
-              </w:rPr>
-              <w:t>{service_summary_positive4}</w:t>
-            </w:r>
-          </w:p>
-          <w:p>
-            <w:pPr>
-              <w:rPr>
-                <w:b/>
-                <w:bCs/>
-                <w:sz w:val="18"/>
-                <w:szCs w:val="18"/>
-              </w:rPr>
-            </w:pPr>
-          </w:p>
-        </w:tc>
-        <w:tc>
-          <w:tcPr>
-            <w:tcW w:w="2481" w:type="dxa"/>
-          </w:tcPr>
-          <w:p>
-            <w:pPr>
-              <w:rPr>
-                <w:sz w:val="18"/>
-                <w:szCs w:val="18"/>
-              </w:rPr>
-            </w:pPr>
-            <w:r>
-              <w:rPr>
-                <w:sz w:val="18"/>
-                <w:szCs w:val="18"/>
-              </w:rPr>
-              <w:t>{service_summary_positive4}</w:t>
-            </w:r>
-          </w:p>
-          <w:p>
-            <w:pPr>
-              <w:rPr>
-                <w:b/>
-                <w:bCs/>
-                <w:sz w:val="18"/>
-                <w:szCs w:val="18"/>
-              </w:rPr>
-            </w:pPr>
-          </w:p>
-        </w:tc>
-      </w:tr>
-      <w:tr>
-        <w:tc>
-          <w:tcPr>
-            <w:tcW w:w="1532" w:type="dxa"/>
-          </w:tcPr>
-          <w:p>
-            <w:pPr>
-              <w:rPr>
-                <w:sz w:val="18"/>
-                <w:szCs w:val="18"/>
-              </w:rPr>
-            </w:pPr>
-            <w:r>
-              <w:rPr>
-                <w:color w:val="000000"/>
-                <w:sz w:val="18"/>
-                <w:szCs w:val="18"/>
-              </w:rPr>
-              <w:t>{#additional_services}{name}</w:t>
-            </w:r>
-          </w:p>
-        </w:tc>
-        <w:tc>
-          <w:tcPr>
-            <w:tcW w:w="2856" w:type="dxa"/>
-          </w:tcPr>
-          <w:p>
-            <w:pPr>
-              <w:rPr>
-                <w:sz w:val="18"/>
-                <w:szCs w:val="18"/>
-              </w:rPr>
-            </w:pPr>
-            <w:r>
-              <w:rPr>
-                <w:color w:val="000000"/>
-                <w:sz w:val="18"/>
-                <w:szCs w:val="18"/>
-              </w:rPr>
-              <w:t>{</w:t>
-            </w:r>
-            <w:proofErr w:type="spellStart"/>
-            <w:r>
-              <w:rPr>
-                <w:color w:val="000000"/>
-                <w:sz w:val="18"/>
-                <w:szCs w:val="18"/>
-              </w:rPr>
-              <w:t>service_summary_negative</w:t>
-            </w:r>
-            <w:proofErr w:type="spellEnd"/>
-            <w:r>
-              <w:rPr>
-                <w:color w:val="000000"/>
+            <w:r>
+              <w:rPr>
+                <w:sz w:val="18"/>
+                <w:szCs w:val="18"/>
+              </w:rPr>
+              <w:t>{service_summary_positive</w:t>
+            </w:r>
+            <w:r>
+              <w:rPr>
                 <w:sz w:val="18"/>
                 <w:szCs w:val="18"/>
               </w:rPr>
               <w:t>}</w:t>
             </w:r>
-          </w:p>
-        </w:tc>
-        <w:tc>
-          <w:tcPr>
-            <w:tcW w:w="2481" w:type="dxa"/>
-          </w:tcPr>
-          <w:p>
-            <w:pPr>
-              <w:rPr>
-                <w:sz w:val="18"/>
-                <w:szCs w:val="18"/>
-              </w:rPr>
-            </w:pPr>
-            <w:r>
-              <w:rPr>
-                <w:color w:val="000000"/>
-                <w:sz w:val="18"/>
-                <w:szCs w:val="18"/>
-              </w:rPr>
-              <w:t>{</w:t>
-            </w:r>
-            <w:proofErr w:type="spellStart"/>
-            <w:r>
-              <w:rPr>
-                <w:color w:val="000000"/>
-                <w:sz w:val="18"/>
-                <w:szCs w:val="18"/>
-              </w:rPr>
-              <w:t>service_summary_neutral</w:t>
-            </w:r>
-            <w:proofErr w:type="spellEnd"/>
-            <w:r>
-              <w:rPr>
-                <w:color w:val="000000"/>
-                <w:sz w:val="18"/>
-                <w:szCs w:val="18"/>
-              </w:rPr>
-              <w:t>}</w:t>
-            </w:r>
-          </w:p>
-        </w:tc>
-        <w:tc>
-          <w:tcPr>
-            <w:tcW w:w="2481" w:type="dxa"/>
-          </w:tcPr>
-          <w:p>
-            <w:pPr>
-              <w:rPr>
-                <w:sz w:val="18"/>
-                <w:szCs w:val="18"/>
-              </w:rPr>
-            </w:pPr>
-            <w:r>
-              <w:rPr>
-                <w:color w:val="000000"/>
-                <w:sz w:val="18"/>
-                <w:szCs w:val="18"/>
-              </w:rPr>
-              <w:t>{</w:t>
-            </w:r>
-            <w:proofErr w:type="spellStart"/>
-            <w:r>
-              <w:rPr>
-                <w:color w:val="000000"/>
-                <w:sz w:val="18"/>
-                <w:szCs w:val="18"/>
-              </w:rPr>
-              <w:t>service_summary_positive</w:t>
-            </w:r>
-            <w:proofErr w:type="spellEnd"/>
-            <w:r>
-              <w:rPr>
-                <w:color w:val="000000"/>
-                <w:sz w:val="18"/>
-                <w:szCs w:val="18"/>
-              </w:rPr>
-              <w:t>}{/</w:t>
-            </w:r>
-            <w:proofErr w:type="spellStart"/>
-            <w:r>
-              <w:rPr>
-                <w:color w:val="000000"/>
-                <w:sz w:val="18"/>
-                <w:szCs w:val="18"/>
-              </w:rPr>
-              <w:t>additional_services</w:t>
-            </w:r>
-            <w:proofErr w:type="spellEnd"/>
-            <w:r>
-              <w:rPr>
-                <w:color w:val="000000"/>
-                <w:sz w:val="18"/>
-                <w:szCs w:val="18"/>
-              </w:rPr>
-              <w:t>}</w:t>
+            <w:r>
+              <w:rPr>
+                <w:sz w:val="18"/>
+                <w:szCs w:val="18"/>
+              </w:rPr>
+              <w:t>{service_summary_positive}{/serviceTooltipRows}</w:t>
             </w:r>
           </w:p>
         </w:tc>

</xml_diff>